<commit_message>
Filled in sweep.csv and completed part D
</commit_message>
<xml_diff>
--- a/Projects/P1/project1_Himadri_Saha/Project_1.docx
+++ b/Projects/P1/project1_Himadri_Saha/Project_1.docx
@@ -333,7 +333,21 @@
         <w:rPr>
           <w:rFonts w:ascii="Times New Roman" w:hAnsi="Times New Roman" w:cs="Times New Roman"/>
         </w:rPr>
-        <w:t xml:space="preserve">for i = </w:t>
+        <w:t xml:space="preserve">for </w:t>
+      </w:r>
+      <w:proofErr w:type="spellStart"/>
+      <w:r>
+        <w:rPr>
+          <w:rFonts w:ascii="Times New Roman" w:hAnsi="Times New Roman" w:cs="Times New Roman"/>
+        </w:rPr>
+        <w:t>i</w:t>
+      </w:r>
+      <w:proofErr w:type="spellEnd"/>
+      <w:r>
+        <w:rPr>
+          <w:rFonts w:ascii="Times New Roman" w:hAnsi="Times New Roman" w:cs="Times New Roman"/>
+        </w:rPr>
+        <w:t xml:space="preserve"> = </w:t>
       </w:r>
       <w:proofErr w:type="gramStart"/>
       <w:r>
@@ -576,6 +590,7 @@
       <w:r>
         <w:rPr>
           <w:rFonts w:ascii="Times New Roman" w:hAnsi="Times New Roman" w:cs="Times New Roman"/>
+          <w:noProof/>
         </w:rPr>
         <w:drawing>
           <wp:inline distT="0" distB="0" distL="0" distR="0" wp14:anchorId="45568BEB" wp14:editId="24429C47">
@@ -858,13 +873,2725 @@
           <w:rFonts w:ascii="Times New Roman" w:hAnsi="Times New Roman" w:cs="Times New Roman"/>
         </w:rPr>
       </w:pPr>
-    </w:p>
-    <w:p>
-      <w:pPr>
-        <w:rPr>
-          <w:rFonts w:ascii="Times New Roman" w:hAnsi="Times New Roman" w:cs="Times New Roman"/>
-        </w:rPr>
-      </w:pPr>
+      <w:r>
+        <w:rPr>
+          <w:rFonts w:ascii="Times New Roman" w:hAnsi="Times New Roman" w:cs="Times New Roman"/>
+        </w:rPr>
+        <w:t xml:space="preserve"> </w:t>
+      </w:r>
+    </w:p>
+    <w:p>
+      <w:pPr>
+        <w:rPr>
+          <w:rFonts w:ascii="Times New Roman" w:hAnsi="Times New Roman" w:cs="Times New Roman"/>
+          <w:i/>
+          <w:iCs/>
+        </w:rPr>
+      </w:pPr>
+      <w:r>
+        <w:rPr>
+          <w:rFonts w:ascii="Times New Roman" w:hAnsi="Times New Roman" w:cs="Times New Roman"/>
+          <w:i/>
+          <w:iCs/>
+        </w:rPr>
+        <w:t>C.6</w:t>
+      </w:r>
+    </w:p>
+    <w:p>
+      <w:pPr>
+        <w:rPr>
+          <w:rFonts w:ascii="Times New Roman" w:hAnsi="Times New Roman" w:cs="Times New Roman"/>
+        </w:rPr>
+      </w:pPr>
+      <w:r>
+        <w:rPr>
+          <w:rFonts w:ascii="Times New Roman" w:hAnsi="Times New Roman" w:cs="Times New Roman"/>
+        </w:rPr>
+        <w:t xml:space="preserve">- </w:t>
+      </w:r>
+      <w:r>
+        <w:rPr>
+          <w:rFonts w:ascii="Times New Roman" w:hAnsi="Times New Roman" w:cs="Times New Roman"/>
+        </w:rPr>
+        <w:t>ALU contributes to the most cycles, it’s the most common class and has the highest CPI amongst the common classes</w:t>
+      </w:r>
+      <w:r>
+        <w:rPr>
+          <w:rFonts w:ascii="Times New Roman" w:hAnsi="Times New Roman" w:cs="Times New Roman"/>
+        </w:rPr>
+        <w:t xml:space="preserve"> (4 compared with 3 for branches and jumps)</w:t>
+      </w:r>
+    </w:p>
+    <w:p>
+      <w:pPr>
+        <w:rPr>
+          <w:rFonts w:ascii="Times New Roman" w:hAnsi="Times New Roman" w:cs="Times New Roman"/>
+        </w:rPr>
+      </w:pPr>
+      <w:r>
+        <w:rPr>
+          <w:rFonts w:ascii="Times New Roman" w:hAnsi="Times New Roman" w:cs="Times New Roman"/>
+        </w:rPr>
+        <w:t xml:space="preserve">- </w:t>
+      </w:r>
+      <w:r>
+        <w:rPr>
+          <w:rFonts w:ascii="Times New Roman" w:hAnsi="Times New Roman" w:cs="Times New Roman"/>
+        </w:rPr>
+        <w:t>f = 72 100 / 78 206 = 0.922</w:t>
+      </w:r>
+      <w:r>
+        <w:rPr>
+          <w:rFonts w:ascii="Times New Roman" w:hAnsi="Times New Roman" w:cs="Times New Roman"/>
+        </w:rPr>
+        <w:t xml:space="preserve"> -&gt;92.2%</w:t>
+      </w:r>
+    </w:p>
+    <w:p>
+      <w:pPr>
+        <w:rPr>
+          <w:rFonts w:ascii="Times New Roman" w:hAnsi="Times New Roman" w:cs="Times New Roman"/>
+        </w:rPr>
+      </w:pPr>
+      <w:r>
+        <w:rPr>
+          <w:rFonts w:ascii="Times New Roman" w:hAnsi="Times New Roman" w:cs="Times New Roman"/>
+        </w:rPr>
+        <w:t xml:space="preserve">- </w:t>
+      </w:r>
+      <w:r>
+        <w:rPr>
+          <w:rFonts w:ascii="Times New Roman" w:hAnsi="Times New Roman" w:cs="Times New Roman"/>
+        </w:rPr>
+        <w:t>Speedup = 1 / [(1 − f) + f/s]</w:t>
+      </w:r>
+    </w:p>
+    <w:p>
+      <w:pPr>
+        <w:rPr>
+          <w:rFonts w:ascii="Times New Roman" w:hAnsi="Times New Roman" w:cs="Times New Roman"/>
+        </w:rPr>
+      </w:pPr>
+      <w:r>
+        <w:rPr>
+          <w:rFonts w:ascii="Times New Roman" w:hAnsi="Times New Roman" w:cs="Times New Roman"/>
+        </w:rPr>
+        <w:t>As s → ∞, the f/s term goes to 0:</w:t>
+      </w:r>
+    </w:p>
+    <w:p>
+      <w:pPr>
+        <w:rPr>
+          <w:rFonts w:ascii="Times New Roman" w:hAnsi="Times New Roman" w:cs="Times New Roman"/>
+        </w:rPr>
+      </w:pPr>
+      <w:proofErr w:type="spellStart"/>
+      <w:r>
+        <w:rPr>
+          <w:rFonts w:ascii="Times New Roman" w:hAnsi="Times New Roman" w:cs="Times New Roman"/>
+        </w:rPr>
+        <w:t>Speedup_max</w:t>
+      </w:r>
+      <w:proofErr w:type="spellEnd"/>
+      <w:r>
+        <w:rPr>
+          <w:rFonts w:ascii="Times New Roman" w:hAnsi="Times New Roman" w:cs="Times New Roman"/>
+        </w:rPr>
+        <w:t xml:space="preserve"> = 1 / (1 − f) = total cycles / (cycles not in </w:t>
+      </w:r>
+      <w:proofErr w:type="spellStart"/>
+      <w:r>
+        <w:rPr>
+          <w:rFonts w:ascii="Times New Roman" w:hAnsi="Times New Roman" w:cs="Times New Roman"/>
+        </w:rPr>
+        <w:t>mult</w:t>
+      </w:r>
+      <w:proofErr w:type="spellEnd"/>
+      <w:r>
+        <w:rPr>
+          <w:rFonts w:ascii="Times New Roman" w:hAnsi="Times New Roman" w:cs="Times New Roman"/>
+        </w:rPr>
+        <w:t>)</w:t>
+      </w:r>
+    </w:p>
+    <w:p>
+      <w:pPr>
+        <w:rPr>
+          <w:rFonts w:ascii="Times New Roman" w:hAnsi="Times New Roman" w:cs="Times New Roman"/>
+        </w:rPr>
+      </w:pPr>
+      <w:r>
+        <w:rPr>
+          <w:rFonts w:ascii="Times New Roman" w:hAnsi="Times New Roman" w:cs="Times New Roman"/>
+        </w:rPr>
+        <w:t>Numbers:</w:t>
+      </w:r>
+    </w:p>
+    <w:p>
+      <w:pPr>
+        <w:rPr>
+          <w:rFonts w:ascii="Times New Roman" w:hAnsi="Times New Roman" w:cs="Times New Roman"/>
+        </w:rPr>
+      </w:pPr>
+      <w:proofErr w:type="spellStart"/>
+      <w:r>
+        <w:rPr>
+          <w:rFonts w:ascii="Times New Roman" w:hAnsi="Times New Roman" w:cs="Times New Roman"/>
+        </w:rPr>
+        <w:t>Speedup_max</w:t>
+      </w:r>
+      <w:proofErr w:type="spellEnd"/>
+      <w:r>
+        <w:rPr>
+          <w:rFonts w:ascii="Times New Roman" w:hAnsi="Times New Roman" w:cs="Times New Roman"/>
+        </w:rPr>
+        <w:t xml:space="preserve"> = 78 206 / (78 206 − 72 100) = 78 206 / 6 106 = 12.81×</w:t>
+      </w:r>
+    </w:p>
+    <w:p>
+      <w:pPr>
+        <w:rPr>
+          <w:rFonts w:ascii="Times New Roman" w:hAnsi="Times New Roman" w:cs="Times New Roman"/>
+        </w:rPr>
+      </w:pPr>
+    </w:p>
+    <w:p>
+      <w:pPr>
+        <w:rPr>
+          <w:rFonts w:ascii="Times New Roman" w:hAnsi="Times New Roman" w:cs="Times New Roman"/>
+          <w:b/>
+          <w:bCs/>
+        </w:rPr>
+      </w:pPr>
+      <w:r>
+        <w:rPr>
+          <w:rFonts w:ascii="Times New Roman" w:hAnsi="Times New Roman" w:cs="Times New Roman"/>
+          <w:b/>
+          <w:bCs/>
+        </w:rPr>
+        <w:t>Part D</w:t>
+      </w:r>
+    </w:p>
+    <w:tbl>
+      <w:tblPr>
+        <w:tblW w:w="0" w:type="auto"/>
+        <w:tblCellSpacing w:w="15" w:type="dxa"/>
+        <w:tblCellMar>
+          <w:top w:w="15" w:type="dxa"/>
+          <w:left w:w="15" w:type="dxa"/>
+          <w:bottom w:w="15" w:type="dxa"/>
+          <w:right w:w="15" w:type="dxa"/>
+        </w:tblCellMar>
+        <w:tblLook w:val="04A0" w:firstRow="1" w:lastRow="0" w:firstColumn="1" w:lastColumn="0" w:noHBand="0" w:noVBand="1"/>
+      </w:tblPr>
+      <w:tblGrid>
+        <w:gridCol w:w="195"/>
+        <w:gridCol w:w="2279"/>
+        <w:gridCol w:w="1644"/>
+        <w:gridCol w:w="1428"/>
+        <w:gridCol w:w="3814"/>
+      </w:tblGrid>
+      <w:tr>
+        <w:trPr>
+          <w:tblHeader/>
+          <w:tblCellSpacing w:w="15" w:type="dxa"/>
+        </w:trPr>
+        <w:tc>
+          <w:tcPr>
+            <w:tcW w:w="0" w:type="auto"/>
+            <w:vAlign w:val="center"/>
+            <w:hideMark/>
+          </w:tcPr>
+          <w:p>
+            <w:pPr>
+              <w:rPr>
+                <w:rFonts w:ascii="Times New Roman" w:hAnsi="Times New Roman" w:cs="Times New Roman"/>
+                <w:b/>
+                <w:bCs/>
+              </w:rPr>
+            </w:pPr>
+            <w:r>
+              <w:rPr>
+                <w:rFonts w:ascii="Times New Roman" w:hAnsi="Times New Roman" w:cs="Times New Roman"/>
+                <w:b/>
+                <w:bCs/>
+              </w:rPr>
+              <w:t>#</w:t>
+            </w:r>
+          </w:p>
+        </w:tc>
+        <w:tc>
+          <w:tcPr>
+            <w:tcW w:w="0" w:type="auto"/>
+            <w:vAlign w:val="center"/>
+            <w:hideMark/>
+          </w:tcPr>
+          <w:p>
+            <w:pPr>
+              <w:rPr>
+                <w:rFonts w:ascii="Times New Roman" w:hAnsi="Times New Roman" w:cs="Times New Roman"/>
+                <w:b/>
+                <w:bCs/>
+              </w:rPr>
+            </w:pPr>
+            <w:r>
+              <w:rPr>
+                <w:rFonts w:ascii="Times New Roman" w:hAnsi="Times New Roman" w:cs="Times New Roman"/>
+                <w:b/>
+                <w:bCs/>
+              </w:rPr>
+              <w:t>Optimization</w:t>
+            </w:r>
+          </w:p>
+        </w:tc>
+        <w:tc>
+          <w:tcPr>
+            <w:tcW w:w="0" w:type="auto"/>
+            <w:vAlign w:val="center"/>
+            <w:hideMark/>
+          </w:tcPr>
+          <w:p>
+            <w:pPr>
+              <w:rPr>
+                <w:rFonts w:ascii="Times New Roman" w:hAnsi="Times New Roman" w:cs="Times New Roman"/>
+                <w:b/>
+                <w:bCs/>
+              </w:rPr>
+            </w:pPr>
+            <w:r>
+              <w:rPr>
+                <w:rFonts w:ascii="Times New Roman" w:hAnsi="Times New Roman" w:cs="Times New Roman"/>
+                <w:b/>
+                <w:bCs/>
+              </w:rPr>
+              <w:t>IC</w:t>
+            </w:r>
+            <w:r>
+              <w:rPr>
+                <w:rFonts w:ascii="Times New Roman" w:hAnsi="Times New Roman" w:cs="Times New Roman"/>
+                <w:b/>
+                <w:bCs/>
+              </w:rPr>
+              <w:t xml:space="preserve"> Changes</w:t>
+            </w:r>
+          </w:p>
+        </w:tc>
+        <w:tc>
+          <w:tcPr>
+            <w:tcW w:w="0" w:type="auto"/>
+            <w:vAlign w:val="center"/>
+            <w:hideMark/>
+          </w:tcPr>
+          <w:p>
+            <w:pPr>
+              <w:rPr>
+                <w:rFonts w:ascii="Times New Roman" w:hAnsi="Times New Roman" w:cs="Times New Roman"/>
+                <w:b/>
+                <w:bCs/>
+              </w:rPr>
+            </w:pPr>
+            <w:r>
+              <w:rPr>
+                <w:rFonts w:ascii="Times New Roman" w:hAnsi="Times New Roman" w:cs="Times New Roman"/>
+                <w:b/>
+                <w:bCs/>
+              </w:rPr>
+              <w:t>CPI</w:t>
+            </w:r>
+            <w:r>
+              <w:rPr>
+                <w:rFonts w:ascii="Times New Roman" w:hAnsi="Times New Roman" w:cs="Times New Roman"/>
+                <w:b/>
+                <w:bCs/>
+              </w:rPr>
+              <w:t xml:space="preserve"> Changes</w:t>
+            </w:r>
+          </w:p>
+        </w:tc>
+        <w:tc>
+          <w:tcPr>
+            <w:tcW w:w="0" w:type="auto"/>
+            <w:vAlign w:val="center"/>
+            <w:hideMark/>
+          </w:tcPr>
+          <w:p>
+            <w:pPr>
+              <w:rPr>
+                <w:rFonts w:ascii="Times New Roman" w:hAnsi="Times New Roman" w:cs="Times New Roman"/>
+                <w:b/>
+                <w:bCs/>
+              </w:rPr>
+            </w:pPr>
+            <w:r>
+              <w:rPr>
+                <w:rFonts w:ascii="Times New Roman" w:hAnsi="Times New Roman" w:cs="Times New Roman"/>
+                <w:b/>
+                <w:bCs/>
+              </w:rPr>
+              <w:t>Why it helps</w:t>
+            </w:r>
+          </w:p>
+        </w:tc>
+      </w:tr>
+      <w:tr>
+        <w:trPr>
+          <w:tblCellSpacing w:w="15" w:type="dxa"/>
+        </w:trPr>
+        <w:tc>
+          <w:tcPr>
+            <w:tcW w:w="0" w:type="auto"/>
+            <w:vAlign w:val="center"/>
+            <w:hideMark/>
+          </w:tcPr>
+          <w:p>
+            <w:pPr>
+              <w:rPr>
+                <w:rFonts w:ascii="Times New Roman" w:hAnsi="Times New Roman" w:cs="Times New Roman"/>
+              </w:rPr>
+            </w:pPr>
+            <w:r>
+              <w:rPr>
+                <w:rFonts w:ascii="Times New Roman" w:hAnsi="Times New Roman" w:cs="Times New Roman"/>
+              </w:rPr>
+              <w:t>1</w:t>
+            </w:r>
+          </w:p>
+        </w:tc>
+        <w:tc>
+          <w:tcPr>
+            <w:tcW w:w="0" w:type="auto"/>
+            <w:vAlign w:val="center"/>
+            <w:hideMark/>
+          </w:tcPr>
+          <w:p>
+            <w:pPr>
+              <w:rPr>
+                <w:rFonts w:ascii="Times New Roman" w:hAnsi="Times New Roman" w:cs="Times New Roman"/>
+              </w:rPr>
+            </w:pPr>
+            <w:r>
+              <w:rPr>
+                <w:rFonts w:ascii="Times New Roman" w:hAnsi="Times New Roman" w:cs="Times New Roman"/>
+                <w:b/>
+                <w:bCs/>
+              </w:rPr>
+              <w:t>Closed-form sum:</w:t>
+            </w:r>
+            <w:r>
+              <w:rPr>
+                <w:rFonts w:ascii="Times New Roman" w:hAnsi="Times New Roman" w:cs="Times New Roman"/>
+              </w:rPr>
+              <w:t xml:space="preserve"> Σi² = n(n+</w:t>
+            </w:r>
+            <w:proofErr w:type="gramStart"/>
+            <w:r>
+              <w:rPr>
+                <w:rFonts w:ascii="Times New Roman" w:hAnsi="Times New Roman" w:cs="Times New Roman"/>
+              </w:rPr>
+              <w:t>1)(</w:t>
+            </w:r>
+            <w:proofErr w:type="gramEnd"/>
+            <w:r>
+              <w:rPr>
+                <w:rFonts w:ascii="Times New Roman" w:hAnsi="Times New Roman" w:cs="Times New Roman"/>
+              </w:rPr>
+              <w:t>2n+1)/6 replaces both loops</w:t>
+            </w:r>
+          </w:p>
+        </w:tc>
+        <w:tc>
+          <w:tcPr>
+            <w:tcW w:w="0" w:type="auto"/>
+            <w:vAlign w:val="center"/>
+            <w:hideMark/>
+          </w:tcPr>
+          <w:p>
+            <w:pPr>
+              <w:rPr>
+                <w:rFonts w:ascii="Times New Roman" w:hAnsi="Times New Roman" w:cs="Times New Roman"/>
+              </w:rPr>
+            </w:pPr>
+            <w:r>
+              <w:rPr>
+                <w:rFonts w:ascii="Times New Roman" w:hAnsi="Times New Roman" w:cs="Times New Roman"/>
+                <w:b/>
+                <w:bCs/>
+              </w:rPr>
+              <w:t>Large drop:</w:t>
+            </w:r>
+            <w:r>
+              <w:rPr>
+                <w:rFonts w:ascii="Times New Roman" w:hAnsi="Times New Roman" w:cs="Times New Roman"/>
+              </w:rPr>
+              <w:t xml:space="preserve"> O(n²) → constant</w:t>
+            </w:r>
+          </w:p>
+        </w:tc>
+        <w:tc>
+          <w:tcPr>
+            <w:tcW w:w="0" w:type="auto"/>
+            <w:vAlign w:val="center"/>
+            <w:hideMark/>
+          </w:tcPr>
+          <w:p>
+            <w:pPr>
+              <w:rPr>
+                <w:rFonts w:ascii="Times New Roman" w:hAnsi="Times New Roman" w:cs="Times New Roman"/>
+              </w:rPr>
+            </w:pPr>
+            <w:r>
+              <w:rPr>
+                <w:rFonts w:ascii="Times New Roman" w:hAnsi="Times New Roman" w:cs="Times New Roman"/>
+                <w:b/>
+                <w:bCs/>
+              </w:rPr>
+              <w:t>Rises</w:t>
+            </w:r>
+            <w:r>
+              <w:rPr>
+                <w:rFonts w:ascii="Times New Roman" w:hAnsi="Times New Roman" w:cs="Times New Roman"/>
+              </w:rPr>
+              <w:t xml:space="preserve"> (</w:t>
+            </w:r>
+            <w:proofErr w:type="gramStart"/>
+            <w:r>
+              <w:rPr>
+                <w:rFonts w:ascii="Times New Roman" w:hAnsi="Times New Roman" w:cs="Times New Roman"/>
+              </w:rPr>
+              <w:t>uses</w:t>
+            </w:r>
+            <w:proofErr w:type="gramEnd"/>
+            <w:r>
+              <w:rPr>
+                <w:rFonts w:ascii="Times New Roman" w:hAnsi="Times New Roman" w:cs="Times New Roman"/>
+              </w:rPr>
+              <w:t xml:space="preserve"> 30-cycle </w:t>
+            </w:r>
+            <w:proofErr w:type="spellStart"/>
+            <w:r>
+              <w:rPr>
+                <w:rFonts w:ascii="Times New Roman" w:hAnsi="Times New Roman" w:cs="Times New Roman"/>
+              </w:rPr>
+              <w:t>mul</w:t>
+            </w:r>
+            <w:proofErr w:type="spellEnd"/>
+            <w:r>
+              <w:rPr>
+                <w:rFonts w:ascii="Times New Roman" w:hAnsi="Times New Roman" w:cs="Times New Roman"/>
+              </w:rPr>
+              <w:t>/div)</w:t>
+            </w:r>
+          </w:p>
+        </w:tc>
+        <w:tc>
+          <w:tcPr>
+            <w:tcW w:w="0" w:type="auto"/>
+            <w:vAlign w:val="center"/>
+            <w:hideMark/>
+          </w:tcPr>
+          <w:p>
+            <w:pPr>
+              <w:rPr>
+                <w:rFonts w:ascii="Times New Roman" w:hAnsi="Times New Roman" w:cs="Times New Roman"/>
+              </w:rPr>
+            </w:pPr>
+            <w:r>
+              <w:rPr>
+                <w:rFonts w:ascii="Times New Roman" w:hAnsi="Times New Roman" w:cs="Times New Roman"/>
+              </w:rPr>
+              <w:t>Removes all the repeated work. This is an algorithm change, not a small tweak.</w:t>
+            </w:r>
+          </w:p>
+        </w:tc>
+      </w:tr>
+      <w:tr>
+        <w:trPr>
+          <w:tblCellSpacing w:w="15" w:type="dxa"/>
+        </w:trPr>
+        <w:tc>
+          <w:tcPr>
+            <w:tcW w:w="0" w:type="auto"/>
+            <w:vAlign w:val="center"/>
+            <w:hideMark/>
+          </w:tcPr>
+          <w:p>
+            <w:pPr>
+              <w:rPr>
+                <w:rFonts w:ascii="Times New Roman" w:hAnsi="Times New Roman" w:cs="Times New Roman"/>
+              </w:rPr>
+            </w:pPr>
+            <w:r>
+              <w:rPr>
+                <w:rFonts w:ascii="Times New Roman" w:hAnsi="Times New Roman" w:cs="Times New Roman"/>
+              </w:rPr>
+              <w:t>2</w:t>
+            </w:r>
+          </w:p>
+        </w:tc>
+        <w:tc>
+          <w:tcPr>
+            <w:tcW w:w="0" w:type="auto"/>
+            <w:vAlign w:val="center"/>
+            <w:hideMark/>
+          </w:tcPr>
+          <w:p>
+            <w:pPr>
+              <w:rPr>
+                <w:rFonts w:ascii="Times New Roman" w:hAnsi="Times New Roman" w:cs="Times New Roman"/>
+              </w:rPr>
+            </w:pPr>
+            <w:r>
+              <w:rPr>
+                <w:rFonts w:ascii="Times New Roman" w:hAnsi="Times New Roman" w:cs="Times New Roman"/>
+                <w:b/>
+                <w:bCs/>
+              </w:rPr>
+              <w:t>No array:</w:t>
+            </w:r>
+            <w:r>
+              <w:rPr>
+                <w:rFonts w:ascii="Times New Roman" w:hAnsi="Times New Roman" w:cs="Times New Roman"/>
+              </w:rPr>
+              <w:t xml:space="preserve"> squares are never stored and reloaded</w:t>
+            </w:r>
+          </w:p>
+        </w:tc>
+        <w:tc>
+          <w:tcPr>
+            <w:tcW w:w="0" w:type="auto"/>
+            <w:vAlign w:val="center"/>
+            <w:hideMark/>
+          </w:tcPr>
+          <w:p>
+            <w:pPr>
+              <w:rPr>
+                <w:rFonts w:ascii="Times New Roman" w:hAnsi="Times New Roman" w:cs="Times New Roman"/>
+              </w:rPr>
+            </w:pPr>
+            <w:r>
+              <w:rPr>
+                <w:rFonts w:ascii="Times New Roman" w:hAnsi="Times New Roman" w:cs="Times New Roman"/>
+              </w:rPr>
+              <w:t xml:space="preserve">Drops by 2n (n </w:t>
+            </w:r>
+            <w:proofErr w:type="spellStart"/>
+            <w:r>
+              <w:rPr>
+                <w:rFonts w:ascii="Times New Roman" w:hAnsi="Times New Roman" w:cs="Times New Roman"/>
+              </w:rPr>
+              <w:t>sw</w:t>
+            </w:r>
+            <w:proofErr w:type="spellEnd"/>
+            <w:r>
+              <w:rPr>
+                <w:rFonts w:ascii="Times New Roman" w:hAnsi="Times New Roman" w:cs="Times New Roman"/>
+              </w:rPr>
+              <w:t xml:space="preserve"> + n </w:t>
+            </w:r>
+            <w:proofErr w:type="spellStart"/>
+            <w:r>
+              <w:rPr>
+                <w:rFonts w:ascii="Times New Roman" w:hAnsi="Times New Roman" w:cs="Times New Roman"/>
+              </w:rPr>
+              <w:t>lw</w:t>
+            </w:r>
+            <w:proofErr w:type="spellEnd"/>
+            <w:r>
+              <w:rPr>
+                <w:rFonts w:ascii="Times New Roman" w:hAnsi="Times New Roman" w:cs="Times New Roman"/>
+              </w:rPr>
+              <w:t>)</w:t>
+            </w:r>
+          </w:p>
+        </w:tc>
+        <w:tc>
+          <w:tcPr>
+            <w:tcW w:w="0" w:type="auto"/>
+            <w:vAlign w:val="center"/>
+            <w:hideMark/>
+          </w:tcPr>
+          <w:p>
+            <w:pPr>
+              <w:rPr>
+                <w:rFonts w:ascii="Times New Roman" w:hAnsi="Times New Roman" w:cs="Times New Roman"/>
+              </w:rPr>
+            </w:pPr>
+            <w:r>
+              <w:rPr>
+                <w:rFonts w:ascii="Times New Roman" w:hAnsi="Times New Roman" w:cs="Times New Roman"/>
+              </w:rPr>
+              <w:t>Removes 4-CPI stores and 5-CPI loads</w:t>
+            </w:r>
+          </w:p>
+        </w:tc>
+        <w:tc>
+          <w:tcPr>
+            <w:tcW w:w="0" w:type="auto"/>
+            <w:vAlign w:val="center"/>
+            <w:hideMark/>
+          </w:tcPr>
+          <w:p>
+            <w:pPr>
+              <w:rPr>
+                <w:rFonts w:ascii="Times New Roman" w:hAnsi="Times New Roman" w:cs="Times New Roman"/>
+              </w:rPr>
+            </w:pPr>
+            <w:r>
+              <w:rPr>
+                <w:rFonts w:ascii="Times New Roman" w:hAnsi="Times New Roman" w:cs="Times New Roman"/>
+              </w:rPr>
+              <w:t>The array was only temporary storage, and memory operations are the most expensive non-</w:t>
+            </w:r>
+            <w:proofErr w:type="spellStart"/>
+            <w:r>
+              <w:rPr>
+                <w:rFonts w:ascii="Times New Roman" w:hAnsi="Times New Roman" w:cs="Times New Roman"/>
+              </w:rPr>
+              <w:t>MulDiv</w:t>
+            </w:r>
+            <w:proofErr w:type="spellEnd"/>
+            <w:r>
+              <w:rPr>
+                <w:rFonts w:ascii="Times New Roman" w:hAnsi="Times New Roman" w:cs="Times New Roman"/>
+              </w:rPr>
+              <w:t xml:space="preserve"> class.</w:t>
+            </w:r>
+          </w:p>
+        </w:tc>
+      </w:tr>
+      <w:tr>
+        <w:trPr>
+          <w:tblCellSpacing w:w="15" w:type="dxa"/>
+        </w:trPr>
+        <w:tc>
+          <w:tcPr>
+            <w:tcW w:w="0" w:type="auto"/>
+            <w:vAlign w:val="center"/>
+            <w:hideMark/>
+          </w:tcPr>
+          <w:p>
+            <w:pPr>
+              <w:rPr>
+                <w:rFonts w:ascii="Times New Roman" w:hAnsi="Times New Roman" w:cs="Times New Roman"/>
+              </w:rPr>
+            </w:pPr>
+            <w:r>
+              <w:rPr>
+                <w:rFonts w:ascii="Times New Roman" w:hAnsi="Times New Roman" w:cs="Times New Roman"/>
+              </w:rPr>
+              <w:t>3</w:t>
+            </w:r>
+          </w:p>
+        </w:tc>
+        <w:tc>
+          <w:tcPr>
+            <w:tcW w:w="0" w:type="auto"/>
+            <w:vAlign w:val="center"/>
+            <w:hideMark/>
+          </w:tcPr>
+          <w:p>
+            <w:pPr>
+              <w:rPr>
+                <w:rFonts w:ascii="Times New Roman" w:hAnsi="Times New Roman" w:cs="Times New Roman"/>
+              </w:rPr>
+            </w:pPr>
+            <w:r>
+              <w:rPr>
+                <w:rFonts w:ascii="Times New Roman" w:hAnsi="Times New Roman" w:cs="Times New Roman"/>
+                <w:b/>
+                <w:bCs/>
+              </w:rPr>
+              <w:t>No subroutine call:</w:t>
+            </w:r>
+            <w:r>
+              <w:rPr>
+                <w:rFonts w:ascii="Times New Roman" w:hAnsi="Times New Roman" w:cs="Times New Roman"/>
+              </w:rPr>
+              <w:t xml:space="preserve"> </w:t>
+            </w:r>
+            <w:proofErr w:type="spellStart"/>
+            <w:r>
+              <w:rPr>
+                <w:rFonts w:ascii="Times New Roman" w:hAnsi="Times New Roman" w:cs="Times New Roman"/>
+              </w:rPr>
+              <w:t>mult</w:t>
+            </w:r>
+            <w:proofErr w:type="spellEnd"/>
+            <w:r>
+              <w:rPr>
+                <w:rFonts w:ascii="Times New Roman" w:hAnsi="Times New Roman" w:cs="Times New Roman"/>
+              </w:rPr>
+              <w:t xml:space="preserve"> is gone entirely</w:t>
+            </w:r>
+          </w:p>
+        </w:tc>
+        <w:tc>
+          <w:tcPr>
+            <w:tcW w:w="0" w:type="auto"/>
+            <w:vAlign w:val="center"/>
+            <w:hideMark/>
+          </w:tcPr>
+          <w:p>
+            <w:pPr>
+              <w:rPr>
+                <w:rFonts w:ascii="Times New Roman" w:hAnsi="Times New Roman" w:cs="Times New Roman"/>
+              </w:rPr>
+            </w:pPr>
+            <w:r>
+              <w:rPr>
+                <w:rFonts w:ascii="Times New Roman" w:hAnsi="Times New Roman" w:cs="Times New Roman"/>
+              </w:rPr>
+              <w:t>Drops by 4n (</w:t>
+            </w:r>
+            <w:proofErr w:type="spellStart"/>
+            <w:r>
+              <w:rPr>
+                <w:rFonts w:ascii="Times New Roman" w:hAnsi="Times New Roman" w:cs="Times New Roman"/>
+              </w:rPr>
+              <w:t>jal</w:t>
+            </w:r>
+            <w:proofErr w:type="spellEnd"/>
+            <w:r>
+              <w:rPr>
+                <w:rFonts w:ascii="Times New Roman" w:hAnsi="Times New Roman" w:cs="Times New Roman"/>
+              </w:rPr>
+              <w:t xml:space="preserve">, </w:t>
+            </w:r>
+            <w:proofErr w:type="spellStart"/>
+            <w:r>
+              <w:rPr>
+                <w:rFonts w:ascii="Times New Roman" w:hAnsi="Times New Roman" w:cs="Times New Roman"/>
+              </w:rPr>
+              <w:t>jalr</w:t>
+            </w:r>
+            <w:proofErr w:type="spellEnd"/>
+            <w:r>
+              <w:rPr>
+                <w:rFonts w:ascii="Times New Roman" w:hAnsi="Times New Roman" w:cs="Times New Roman"/>
+              </w:rPr>
+              <w:t>, setup, return move)</w:t>
+            </w:r>
+          </w:p>
+        </w:tc>
+        <w:tc>
+          <w:tcPr>
+            <w:tcW w:w="0" w:type="auto"/>
+            <w:vAlign w:val="center"/>
+            <w:hideMark/>
+          </w:tcPr>
+          <w:p>
+            <w:pPr>
+              <w:rPr>
+                <w:rFonts w:ascii="Times New Roman" w:hAnsi="Times New Roman" w:cs="Times New Roman"/>
+              </w:rPr>
+            </w:pPr>
+            <w:r>
+              <w:rPr>
+                <w:rFonts w:ascii="Times New Roman" w:hAnsi="Times New Roman" w:cs="Times New Roman"/>
+              </w:rPr>
+              <w:t>—</w:t>
+            </w:r>
+          </w:p>
+        </w:tc>
+        <w:tc>
+          <w:tcPr>
+            <w:tcW w:w="0" w:type="auto"/>
+            <w:vAlign w:val="center"/>
+            <w:hideMark/>
+          </w:tcPr>
+          <w:p>
+            <w:pPr>
+              <w:rPr>
+                <w:rFonts w:ascii="Times New Roman" w:hAnsi="Times New Roman" w:cs="Times New Roman"/>
+              </w:rPr>
+            </w:pPr>
+            <w:r>
+              <w:rPr>
+                <w:rFonts w:ascii="Times New Roman" w:hAnsi="Times New Roman" w:cs="Times New Roman"/>
+              </w:rPr>
+              <w:t>Removes call overhead along with the loop inside it.</w:t>
+            </w:r>
+          </w:p>
+        </w:tc>
+      </w:tr>
+      <w:tr>
+        <w:trPr>
+          <w:tblCellSpacing w:w="15" w:type="dxa"/>
+        </w:trPr>
+        <w:tc>
+          <w:tcPr>
+            <w:tcW w:w="0" w:type="auto"/>
+            <w:vAlign w:val="center"/>
+            <w:hideMark/>
+          </w:tcPr>
+          <w:p>
+            <w:pPr>
+              <w:rPr>
+                <w:rFonts w:ascii="Times New Roman" w:hAnsi="Times New Roman" w:cs="Times New Roman"/>
+              </w:rPr>
+            </w:pPr>
+            <w:r>
+              <w:rPr>
+                <w:rFonts w:ascii="Times New Roman" w:hAnsi="Times New Roman" w:cs="Times New Roman"/>
+              </w:rPr>
+              <w:lastRenderedPageBreak/>
+              <w:t>4</w:t>
+            </w:r>
+          </w:p>
+        </w:tc>
+        <w:tc>
+          <w:tcPr>
+            <w:tcW w:w="0" w:type="auto"/>
+            <w:vAlign w:val="center"/>
+            <w:hideMark/>
+          </w:tcPr>
+          <w:p>
+            <w:pPr>
+              <w:rPr>
+                <w:rFonts w:ascii="Times New Roman" w:hAnsi="Times New Roman" w:cs="Times New Roman"/>
+              </w:rPr>
+            </w:pPr>
+            <w:r>
+              <w:rPr>
+                <w:rFonts w:ascii="Times New Roman" w:hAnsi="Times New Roman" w:cs="Times New Roman"/>
+                <w:b/>
+                <w:bCs/>
+              </w:rPr>
+              <w:t>Strength reduction:</w:t>
+            </w:r>
+            <w:r>
+              <w:rPr>
+                <w:rFonts w:ascii="Times New Roman" w:hAnsi="Times New Roman" w:cs="Times New Roman"/>
+              </w:rPr>
+              <w:t xml:space="preserve"> ÷2 done with </w:t>
+            </w:r>
+            <w:proofErr w:type="spellStart"/>
+            <w:r>
+              <w:rPr>
+                <w:rFonts w:ascii="Times New Roman" w:hAnsi="Times New Roman" w:cs="Times New Roman"/>
+              </w:rPr>
+              <w:t>srli</w:t>
+            </w:r>
+            <w:proofErr w:type="spellEnd"/>
+            <w:r>
+              <w:rPr>
+                <w:rFonts w:ascii="Times New Roman" w:hAnsi="Times New Roman" w:cs="Times New Roman"/>
+              </w:rPr>
+              <w:t xml:space="preserve"> instead of div</w:t>
+            </w:r>
+          </w:p>
+        </w:tc>
+        <w:tc>
+          <w:tcPr>
+            <w:tcW w:w="0" w:type="auto"/>
+            <w:vAlign w:val="center"/>
+            <w:hideMark/>
+          </w:tcPr>
+          <w:p>
+            <w:pPr>
+              <w:rPr>
+                <w:rFonts w:ascii="Times New Roman" w:hAnsi="Times New Roman" w:cs="Times New Roman"/>
+              </w:rPr>
+            </w:pPr>
+            <w:r>
+              <w:rPr>
+                <w:rFonts w:ascii="Times New Roman" w:hAnsi="Times New Roman" w:cs="Times New Roman"/>
+              </w:rPr>
+              <w:t>— (still 1 instruction)</w:t>
+            </w:r>
+          </w:p>
+        </w:tc>
+        <w:tc>
+          <w:tcPr>
+            <w:tcW w:w="0" w:type="auto"/>
+            <w:vAlign w:val="center"/>
+            <w:hideMark/>
+          </w:tcPr>
+          <w:p>
+            <w:pPr>
+              <w:rPr>
+                <w:rFonts w:ascii="Times New Roman" w:hAnsi="Times New Roman" w:cs="Times New Roman"/>
+              </w:rPr>
+            </w:pPr>
+            <w:r>
+              <w:rPr>
+                <w:rFonts w:ascii="Times New Roman" w:hAnsi="Times New Roman" w:cs="Times New Roman"/>
+                <w:b/>
+                <w:bCs/>
+              </w:rPr>
+              <w:t>Drops:</w:t>
+            </w:r>
+            <w:r>
+              <w:rPr>
+                <w:rFonts w:ascii="Times New Roman" w:hAnsi="Times New Roman" w:cs="Times New Roman"/>
+              </w:rPr>
+              <w:t xml:space="preserve"> 4 cycles instead of 30</w:t>
+            </w:r>
+          </w:p>
+        </w:tc>
+        <w:tc>
+          <w:tcPr>
+            <w:tcW w:w="0" w:type="auto"/>
+            <w:vAlign w:val="center"/>
+            <w:hideMark/>
+          </w:tcPr>
+          <w:p>
+            <w:pPr>
+              <w:rPr>
+                <w:rFonts w:ascii="Times New Roman" w:hAnsi="Times New Roman" w:cs="Times New Roman"/>
+              </w:rPr>
+            </w:pPr>
+            <w:r>
+              <w:rPr>
+                <w:rFonts w:ascii="Times New Roman" w:hAnsi="Times New Roman" w:cs="Times New Roman"/>
+              </w:rPr>
+              <w:t>n(n+1) is always even, so a shift gives the exact result. Saves 26 cycles.</w:t>
+            </w:r>
+          </w:p>
+        </w:tc>
+      </w:tr>
+      <w:tr>
+        <w:trPr>
+          <w:tblCellSpacing w:w="15" w:type="dxa"/>
+        </w:trPr>
+        <w:tc>
+          <w:tcPr>
+            <w:tcW w:w="0" w:type="auto"/>
+            <w:vAlign w:val="center"/>
+            <w:hideMark/>
+          </w:tcPr>
+          <w:p>
+            <w:pPr>
+              <w:rPr>
+                <w:rFonts w:ascii="Times New Roman" w:hAnsi="Times New Roman" w:cs="Times New Roman"/>
+              </w:rPr>
+            </w:pPr>
+            <w:r>
+              <w:rPr>
+                <w:rFonts w:ascii="Times New Roman" w:hAnsi="Times New Roman" w:cs="Times New Roman"/>
+              </w:rPr>
+              <w:t>5</w:t>
+            </w:r>
+          </w:p>
+        </w:tc>
+        <w:tc>
+          <w:tcPr>
+            <w:tcW w:w="0" w:type="auto"/>
+            <w:vAlign w:val="center"/>
+            <w:hideMark/>
+          </w:tcPr>
+          <w:p>
+            <w:pPr>
+              <w:rPr>
+                <w:rFonts w:ascii="Times New Roman" w:hAnsi="Times New Roman" w:cs="Times New Roman"/>
+              </w:rPr>
+            </w:pPr>
+            <w:r>
+              <w:rPr>
+                <w:rFonts w:ascii="Times New Roman" w:hAnsi="Times New Roman" w:cs="Times New Roman"/>
+                <w:b/>
+                <w:bCs/>
+              </w:rPr>
+              <w:t>2n + 1 computed as add t2, a0, t0</w:t>
+            </w:r>
+            <w:r>
+              <w:rPr>
+                <w:rFonts w:ascii="Times New Roman" w:hAnsi="Times New Roman" w:cs="Times New Roman"/>
+              </w:rPr>
+              <w:t>, i.e. n + (n+1)</w:t>
+            </w:r>
+          </w:p>
+        </w:tc>
+        <w:tc>
+          <w:tcPr>
+            <w:tcW w:w="0" w:type="auto"/>
+            <w:vAlign w:val="center"/>
+            <w:hideMark/>
+          </w:tcPr>
+          <w:p>
+            <w:pPr>
+              <w:rPr>
+                <w:rFonts w:ascii="Times New Roman" w:hAnsi="Times New Roman" w:cs="Times New Roman"/>
+              </w:rPr>
+            </w:pPr>
+            <w:r>
+              <w:rPr>
+                <w:rFonts w:ascii="Times New Roman" w:hAnsi="Times New Roman" w:cs="Times New Roman"/>
+              </w:rPr>
+              <w:t xml:space="preserve">Drops by 1 (instead of </w:t>
+            </w:r>
+            <w:proofErr w:type="spellStart"/>
+            <w:r>
+              <w:rPr>
+                <w:rFonts w:ascii="Times New Roman" w:hAnsi="Times New Roman" w:cs="Times New Roman"/>
+              </w:rPr>
+              <w:t>slli</w:t>
+            </w:r>
+            <w:proofErr w:type="spellEnd"/>
+            <w:r>
+              <w:rPr>
+                <w:rFonts w:ascii="Times New Roman" w:hAnsi="Times New Roman" w:cs="Times New Roman"/>
+              </w:rPr>
+              <w:t xml:space="preserve"> + </w:t>
+            </w:r>
+            <w:proofErr w:type="spellStart"/>
+            <w:r>
+              <w:rPr>
+                <w:rFonts w:ascii="Times New Roman" w:hAnsi="Times New Roman" w:cs="Times New Roman"/>
+              </w:rPr>
+              <w:t>addi</w:t>
+            </w:r>
+            <w:proofErr w:type="spellEnd"/>
+            <w:r>
+              <w:rPr>
+                <w:rFonts w:ascii="Times New Roman" w:hAnsi="Times New Roman" w:cs="Times New Roman"/>
+              </w:rPr>
+              <w:t>)</w:t>
+            </w:r>
+          </w:p>
+        </w:tc>
+        <w:tc>
+          <w:tcPr>
+            <w:tcW w:w="0" w:type="auto"/>
+            <w:vAlign w:val="center"/>
+            <w:hideMark/>
+          </w:tcPr>
+          <w:p>
+            <w:pPr>
+              <w:rPr>
+                <w:rFonts w:ascii="Times New Roman" w:hAnsi="Times New Roman" w:cs="Times New Roman"/>
+              </w:rPr>
+            </w:pPr>
+            <w:r>
+              <w:rPr>
+                <w:rFonts w:ascii="Times New Roman" w:hAnsi="Times New Roman" w:cs="Times New Roman"/>
+              </w:rPr>
+              <w:t>—</w:t>
+            </w:r>
+          </w:p>
+        </w:tc>
+        <w:tc>
+          <w:tcPr>
+            <w:tcW w:w="0" w:type="auto"/>
+            <w:vAlign w:val="center"/>
+            <w:hideMark/>
+          </w:tcPr>
+          <w:p>
+            <w:pPr>
+              <w:rPr>
+                <w:rFonts w:ascii="Times New Roman" w:hAnsi="Times New Roman" w:cs="Times New Roman"/>
+              </w:rPr>
+            </w:pPr>
+            <w:r>
+              <w:rPr>
+                <w:rFonts w:ascii="Times New Roman" w:hAnsi="Times New Roman" w:cs="Times New Roman"/>
+              </w:rPr>
+              <w:t>Reuses the n+1 already computed. Saves 4 cycles.</w:t>
+            </w:r>
+          </w:p>
+        </w:tc>
+      </w:tr>
+      <w:tr>
+        <w:trPr>
+          <w:tblCellSpacing w:w="15" w:type="dxa"/>
+        </w:trPr>
+        <w:tc>
+          <w:tcPr>
+            <w:tcW w:w="0" w:type="auto"/>
+            <w:vAlign w:val="center"/>
+            <w:hideMark/>
+          </w:tcPr>
+          <w:p>
+            <w:pPr>
+              <w:rPr>
+                <w:rFonts w:ascii="Times New Roman" w:hAnsi="Times New Roman" w:cs="Times New Roman"/>
+              </w:rPr>
+            </w:pPr>
+            <w:r>
+              <w:rPr>
+                <w:rFonts w:ascii="Times New Roman" w:hAnsi="Times New Roman" w:cs="Times New Roman"/>
+              </w:rPr>
+              <w:t>6</w:t>
+            </w:r>
+          </w:p>
+        </w:tc>
+        <w:tc>
+          <w:tcPr>
+            <w:tcW w:w="0" w:type="auto"/>
+            <w:vAlign w:val="center"/>
+            <w:hideMark/>
+          </w:tcPr>
+          <w:p>
+            <w:pPr>
+              <w:rPr>
+                <w:rFonts w:ascii="Times New Roman" w:hAnsi="Times New Roman" w:cs="Times New Roman"/>
+              </w:rPr>
+            </w:pPr>
+            <w:r>
+              <w:rPr>
+                <w:rFonts w:ascii="Times New Roman" w:hAnsi="Times New Roman" w:cs="Times New Roman"/>
+                <w:b/>
+                <w:bCs/>
+              </w:rPr>
+              <w:t xml:space="preserve">Removed the redundant </w:t>
+            </w:r>
+            <w:proofErr w:type="spellStart"/>
+            <w:r>
+              <w:rPr>
+                <w:rFonts w:ascii="Times New Roman" w:hAnsi="Times New Roman" w:cs="Times New Roman"/>
+                <w:b/>
+                <w:bCs/>
+              </w:rPr>
+              <w:t>addi</w:t>
+            </w:r>
+            <w:proofErr w:type="spellEnd"/>
+            <w:r>
+              <w:rPr>
+                <w:rFonts w:ascii="Times New Roman" w:hAnsi="Times New Roman" w:cs="Times New Roman"/>
+                <w:b/>
+                <w:bCs/>
+              </w:rPr>
+              <w:t xml:space="preserve"> a0, a0</w:t>
+            </w:r>
+            <w:proofErr w:type="gramStart"/>
+            <w:r>
+              <w:rPr>
+                <w:rFonts w:ascii="Times New Roman" w:hAnsi="Times New Roman" w:cs="Times New Roman"/>
+                <w:b/>
+                <w:bCs/>
+              </w:rPr>
+              <w:t>, 0</w:t>
+            </w:r>
+            <w:proofErr w:type="gramEnd"/>
+            <w:r>
+              <w:rPr>
+                <w:rFonts w:ascii="Times New Roman" w:hAnsi="Times New Roman" w:cs="Times New Roman"/>
+                <w:b/>
+                <w:bCs/>
+              </w:rPr>
+              <w:t xml:space="preserve"> after </w:t>
+            </w:r>
+            <w:proofErr w:type="spellStart"/>
+            <w:r>
+              <w:rPr>
+                <w:rFonts w:ascii="Times New Roman" w:hAnsi="Times New Roman" w:cs="Times New Roman"/>
+                <w:b/>
+                <w:bCs/>
+              </w:rPr>
+              <w:t>lui</w:t>
+            </w:r>
+            <w:proofErr w:type="spellEnd"/>
+          </w:p>
+        </w:tc>
+        <w:tc>
+          <w:tcPr>
+            <w:tcW w:w="0" w:type="auto"/>
+            <w:vAlign w:val="center"/>
+            <w:hideMark/>
+          </w:tcPr>
+          <w:p>
+            <w:pPr>
+              <w:rPr>
+                <w:rFonts w:ascii="Times New Roman" w:hAnsi="Times New Roman" w:cs="Times New Roman"/>
+              </w:rPr>
+            </w:pPr>
+            <w:r>
+              <w:rPr>
+                <w:rFonts w:ascii="Times New Roman" w:hAnsi="Times New Roman" w:cs="Times New Roman"/>
+              </w:rPr>
+              <w:t>Drops by 1</w:t>
+            </w:r>
+          </w:p>
+        </w:tc>
+        <w:tc>
+          <w:tcPr>
+            <w:tcW w:w="0" w:type="auto"/>
+            <w:vAlign w:val="center"/>
+            <w:hideMark/>
+          </w:tcPr>
+          <w:p>
+            <w:pPr>
+              <w:rPr>
+                <w:rFonts w:ascii="Times New Roman" w:hAnsi="Times New Roman" w:cs="Times New Roman"/>
+              </w:rPr>
+            </w:pPr>
+            <w:r>
+              <w:rPr>
+                <w:rFonts w:ascii="Times New Roman" w:hAnsi="Times New Roman" w:cs="Times New Roman"/>
+              </w:rPr>
+              <w:t>—</w:t>
+            </w:r>
+          </w:p>
+        </w:tc>
+        <w:tc>
+          <w:tcPr>
+            <w:tcW w:w="0" w:type="auto"/>
+            <w:vAlign w:val="center"/>
+            <w:hideMark/>
+          </w:tcPr>
+          <w:p>
+            <w:pPr>
+              <w:rPr>
+                <w:rFonts w:ascii="Times New Roman" w:hAnsi="Times New Roman" w:cs="Times New Roman"/>
+              </w:rPr>
+            </w:pPr>
+            <w:r>
+              <w:rPr>
+                <w:rFonts w:ascii="Times New Roman" w:hAnsi="Times New Roman" w:cs="Times New Roman"/>
+              </w:rPr>
+              <w:t xml:space="preserve">The string is at 0x10010000, so its low 12 bits are 0 and </w:t>
+            </w:r>
+            <w:proofErr w:type="spellStart"/>
+            <w:r>
+              <w:rPr>
+                <w:rFonts w:ascii="Times New Roman" w:hAnsi="Times New Roman" w:cs="Times New Roman"/>
+              </w:rPr>
+              <w:t>lui</w:t>
+            </w:r>
+            <w:proofErr w:type="spellEnd"/>
+            <w:r>
+              <w:rPr>
+                <w:rFonts w:ascii="Times New Roman" w:hAnsi="Times New Roman" w:cs="Times New Roman"/>
+              </w:rPr>
+              <w:t xml:space="preserve"> alone builds the full address. Saves 4 cycles.</w:t>
+            </w:r>
+          </w:p>
+        </w:tc>
+      </w:tr>
+      <w:tr>
+        <w:trPr>
+          <w:tblCellSpacing w:w="15" w:type="dxa"/>
+        </w:trPr>
+        <w:tc>
+          <w:tcPr>
+            <w:tcW w:w="0" w:type="auto"/>
+            <w:vAlign w:val="center"/>
+            <w:hideMark/>
+          </w:tcPr>
+          <w:p>
+            <w:pPr>
+              <w:rPr>
+                <w:rFonts w:ascii="Times New Roman" w:hAnsi="Times New Roman" w:cs="Times New Roman"/>
+              </w:rPr>
+            </w:pPr>
+            <w:r>
+              <w:rPr>
+                <w:rFonts w:ascii="Times New Roman" w:hAnsi="Times New Roman" w:cs="Times New Roman"/>
+              </w:rPr>
+              <w:t>7</w:t>
+            </w:r>
+          </w:p>
+        </w:tc>
+        <w:tc>
+          <w:tcPr>
+            <w:tcW w:w="0" w:type="auto"/>
+            <w:vAlign w:val="center"/>
+            <w:hideMark/>
+          </w:tcPr>
+          <w:p>
+            <w:pPr>
+              <w:rPr>
+                <w:rFonts w:ascii="Times New Roman" w:hAnsi="Times New Roman" w:cs="Times New Roman"/>
+              </w:rPr>
+            </w:pPr>
+            <w:r>
+              <w:rPr>
+                <w:rFonts w:ascii="Times New Roman" w:hAnsi="Times New Roman" w:cs="Times New Roman"/>
+                <w:b/>
+                <w:bCs/>
+              </w:rPr>
+              <w:t>Reordered to compute the result straight into a0</w:t>
+            </w:r>
+          </w:p>
+        </w:tc>
+        <w:tc>
+          <w:tcPr>
+            <w:tcW w:w="0" w:type="auto"/>
+            <w:vAlign w:val="center"/>
+            <w:hideMark/>
+          </w:tcPr>
+          <w:p>
+            <w:pPr>
+              <w:rPr>
+                <w:rFonts w:ascii="Times New Roman" w:hAnsi="Times New Roman" w:cs="Times New Roman"/>
+              </w:rPr>
+            </w:pPr>
+            <w:r>
+              <w:rPr>
+                <w:rFonts w:ascii="Times New Roman" w:hAnsi="Times New Roman" w:cs="Times New Roman"/>
+              </w:rPr>
+              <w:t>Drops by 1 (no mv before print-int)</w:t>
+            </w:r>
+          </w:p>
+        </w:tc>
+        <w:tc>
+          <w:tcPr>
+            <w:tcW w:w="0" w:type="auto"/>
+            <w:vAlign w:val="center"/>
+            <w:hideMark/>
+          </w:tcPr>
+          <w:p>
+            <w:pPr>
+              <w:rPr>
+                <w:rFonts w:ascii="Times New Roman" w:hAnsi="Times New Roman" w:cs="Times New Roman"/>
+              </w:rPr>
+            </w:pPr>
+            <w:r>
+              <w:rPr>
+                <w:rFonts w:ascii="Times New Roman" w:hAnsi="Times New Roman" w:cs="Times New Roman"/>
+              </w:rPr>
+              <w:t>—</w:t>
+            </w:r>
+          </w:p>
+        </w:tc>
+        <w:tc>
+          <w:tcPr>
+            <w:tcW w:w="0" w:type="auto"/>
+            <w:vAlign w:val="center"/>
+            <w:hideMark/>
+          </w:tcPr>
+          <w:p>
+            <w:pPr>
+              <w:rPr>
+                <w:rFonts w:ascii="Times New Roman" w:hAnsi="Times New Roman" w:cs="Times New Roman"/>
+              </w:rPr>
+            </w:pPr>
+            <w:r>
+              <w:rPr>
+                <w:rFonts w:ascii="Times New Roman" w:hAnsi="Times New Roman" w:cs="Times New Roman"/>
+              </w:rPr>
+              <w:t xml:space="preserve">The work starts while a0 still holds n, so the final </w:t>
+            </w:r>
+            <w:proofErr w:type="spellStart"/>
+            <w:r>
+              <w:rPr>
+                <w:rFonts w:ascii="Times New Roman" w:hAnsi="Times New Roman" w:cs="Times New Roman"/>
+              </w:rPr>
+              <w:t>divu</w:t>
+            </w:r>
+            <w:proofErr w:type="spellEnd"/>
+            <w:r>
+              <w:rPr>
+                <w:rFonts w:ascii="Times New Roman" w:hAnsi="Times New Roman" w:cs="Times New Roman"/>
+              </w:rPr>
+              <w:t xml:space="preserve"> writes the value to print directly into a0. Saves 4 cycles.</w:t>
+            </w:r>
+          </w:p>
+        </w:tc>
+      </w:tr>
+      <w:tr>
+        <w:trPr>
+          <w:tblCellSpacing w:w="15" w:type="dxa"/>
+        </w:trPr>
+        <w:tc>
+          <w:tcPr>
+            <w:tcW w:w="0" w:type="auto"/>
+            <w:vAlign w:val="center"/>
+            <w:hideMark/>
+          </w:tcPr>
+          <w:p>
+            <w:pPr>
+              <w:rPr>
+                <w:rFonts w:ascii="Times New Roman" w:hAnsi="Times New Roman" w:cs="Times New Roman"/>
+              </w:rPr>
+            </w:pPr>
+            <w:r>
+              <w:rPr>
+                <w:rFonts w:ascii="Times New Roman" w:hAnsi="Times New Roman" w:cs="Times New Roman"/>
+              </w:rPr>
+              <w:t>8</w:t>
+            </w:r>
+          </w:p>
+        </w:tc>
+        <w:tc>
+          <w:tcPr>
+            <w:tcW w:w="0" w:type="auto"/>
+            <w:vAlign w:val="center"/>
+            <w:hideMark/>
+          </w:tcPr>
+          <w:p>
+            <w:pPr>
+              <w:rPr>
+                <w:rFonts w:ascii="Times New Roman" w:hAnsi="Times New Roman" w:cs="Times New Roman"/>
+              </w:rPr>
+            </w:pPr>
+            <w:r>
+              <w:rPr>
+                <w:rFonts w:ascii="Times New Roman" w:hAnsi="Times New Roman" w:cs="Times New Roman"/>
+                <w:b/>
+                <w:bCs/>
+              </w:rPr>
+              <w:t>Negative-input guard</w:t>
+            </w:r>
+            <w:r>
+              <w:rPr>
+                <w:rFonts w:ascii="Times New Roman" w:hAnsi="Times New Roman" w:cs="Times New Roman"/>
+              </w:rPr>
+              <w:t xml:space="preserve"> (</w:t>
+            </w:r>
+            <w:proofErr w:type="spellStart"/>
+            <w:r>
+              <w:rPr>
+                <w:rFonts w:ascii="Times New Roman" w:hAnsi="Times New Roman" w:cs="Times New Roman"/>
+              </w:rPr>
+              <w:t>bge</w:t>
+            </w:r>
+            <w:proofErr w:type="spellEnd"/>
+            <w:r>
+              <w:rPr>
+                <w:rFonts w:ascii="Times New Roman" w:hAnsi="Times New Roman" w:cs="Times New Roman"/>
+              </w:rPr>
+              <w:t>)</w:t>
+            </w:r>
+          </w:p>
+        </w:tc>
+        <w:tc>
+          <w:tcPr>
+            <w:tcW w:w="0" w:type="auto"/>
+            <w:vAlign w:val="center"/>
+            <w:hideMark/>
+          </w:tcPr>
+          <w:p>
+            <w:pPr>
+              <w:rPr>
+                <w:rFonts w:ascii="Times New Roman" w:hAnsi="Times New Roman" w:cs="Times New Roman"/>
+              </w:rPr>
+            </w:pPr>
+            <w:r>
+              <w:rPr>
+                <w:rFonts w:ascii="Times New Roman" w:hAnsi="Times New Roman" w:cs="Times New Roman"/>
+                <w:b/>
+                <w:bCs/>
+              </w:rPr>
+              <w:t>Rises</w:t>
+            </w:r>
+            <w:r>
+              <w:rPr>
+                <w:rFonts w:ascii="Times New Roman" w:hAnsi="Times New Roman" w:cs="Times New Roman"/>
+              </w:rPr>
+              <w:t xml:space="preserve"> by 1</w:t>
+            </w:r>
+          </w:p>
+        </w:tc>
+        <w:tc>
+          <w:tcPr>
+            <w:tcW w:w="0" w:type="auto"/>
+            <w:vAlign w:val="center"/>
+            <w:hideMark/>
+          </w:tcPr>
+          <w:p>
+            <w:pPr>
+              <w:rPr>
+                <w:rFonts w:ascii="Times New Roman" w:hAnsi="Times New Roman" w:cs="Times New Roman"/>
+              </w:rPr>
+            </w:pPr>
+            <w:r>
+              <w:rPr>
+                <w:rFonts w:ascii="Times New Roman" w:hAnsi="Times New Roman" w:cs="Times New Roman"/>
+              </w:rPr>
+              <w:t>—</w:t>
+            </w:r>
+          </w:p>
+        </w:tc>
+        <w:tc>
+          <w:tcPr>
+            <w:tcW w:w="0" w:type="auto"/>
+            <w:vAlign w:val="center"/>
+            <w:hideMark/>
+          </w:tcPr>
+          <w:p>
+            <w:pPr>
+              <w:rPr>
+                <w:rFonts w:ascii="Times New Roman" w:hAnsi="Times New Roman" w:cs="Times New Roman"/>
+              </w:rPr>
+            </w:pPr>
+            <w:r>
+              <w:rPr>
+                <w:rFonts w:ascii="Times New Roman" w:hAnsi="Times New Roman" w:cs="Times New Roman"/>
+              </w:rPr>
+              <w:t>Costs 3 cycles. Kept for correctness: the original prints 0 for n &lt; 1, but the formula alone would print nonzero values for some negative n (for example, n = −2 gives −1).</w:t>
+            </w:r>
+          </w:p>
+        </w:tc>
+      </w:tr>
+    </w:tbl>
+    <w:p>
+      <w:pPr>
+        <w:rPr>
+          <w:rFonts w:ascii="Times New Roman" w:hAnsi="Times New Roman" w:cs="Times New Roman"/>
+        </w:rPr>
+      </w:pPr>
+      <w:r>
+        <w:rPr>
+          <w:rFonts w:ascii="Times New Roman" w:hAnsi="Times New Roman" w:cs="Times New Roman"/>
+        </w:rPr>
+        <w:t>RV32M is worth it for any meaningful n. Each 30-cycle instruction replaces work that grows with n, so its fixed cost pays for itself quickly. For very small inputs, though, a pure RV32I version would be faster.</w:t>
+      </w:r>
+    </w:p>
+    <w:p>
+      <w:pPr>
+        <w:rPr>
+          <w:rFonts w:ascii="Times New Roman" w:hAnsi="Times New Roman" w:cs="Times New Roman"/>
+        </w:rPr>
+      </w:pPr>
+      <w:r>
+        <w:rPr>
+          <w:rFonts w:ascii="Times New Roman" w:hAnsi="Times New Roman" w:cs="Times New Roman"/>
+        </w:rPr>
+        <w:t xml:space="preserve">When </w:t>
+      </w:r>
+      <w:proofErr w:type="spellStart"/>
+      <w:r>
+        <w:rPr>
+          <w:rFonts w:ascii="Times New Roman" w:hAnsi="Times New Roman" w:cs="Times New Roman"/>
+        </w:rPr>
+        <w:t>mul</w:t>
+      </w:r>
+      <w:proofErr w:type="spellEnd"/>
+      <w:r>
+        <w:rPr>
+          <w:rFonts w:ascii="Times New Roman" w:hAnsi="Times New Roman" w:cs="Times New Roman"/>
+        </w:rPr>
+        <w:t xml:space="preserve"> costs 30 cycles:</w:t>
+      </w:r>
+    </w:p>
+    <w:p>
+      <w:pPr>
+        <w:rPr>
+          <w:rFonts w:ascii="Times New Roman" w:hAnsi="Times New Roman" w:cs="Times New Roman"/>
+        </w:rPr>
+      </w:pPr>
+      <w:proofErr w:type="spellStart"/>
+      <w:proofErr w:type="gramStart"/>
+      <w:r>
+        <w:rPr>
+          <w:rFonts w:ascii="Times New Roman" w:hAnsi="Times New Roman" w:cs="Times New Roman"/>
+        </w:rPr>
+        <w:t>i</w:t>
+      </w:r>
+      <w:proofErr w:type="spellEnd"/>
+      <w:r>
+        <w:rPr>
+          <w:rFonts w:ascii="Times New Roman" w:hAnsi="Times New Roman" w:cs="Times New Roman"/>
+        </w:rPr>
+        <w:tab/>
+        <w:t>Repeated</w:t>
+      </w:r>
+      <w:proofErr w:type="gramEnd"/>
+      <w:r>
+        <w:rPr>
+          <w:rFonts w:ascii="Times New Roman" w:hAnsi="Times New Roman" w:cs="Times New Roman"/>
+        </w:rPr>
+        <w:t xml:space="preserve"> addition (14i + 14)</w:t>
+      </w:r>
+      <w:r>
+        <w:rPr>
+          <w:rFonts w:ascii="Times New Roman" w:hAnsi="Times New Roman" w:cs="Times New Roman"/>
+        </w:rPr>
+        <w:tab/>
+      </w:r>
+      <w:proofErr w:type="spellStart"/>
+      <w:r>
+        <w:rPr>
+          <w:rFonts w:ascii="Times New Roman" w:hAnsi="Times New Roman" w:cs="Times New Roman"/>
+        </w:rPr>
+        <w:t>mul</w:t>
+      </w:r>
+      <w:proofErr w:type="spellEnd"/>
+      <w:r>
+        <w:rPr>
+          <w:rFonts w:ascii="Times New Roman" w:hAnsi="Times New Roman" w:cs="Times New Roman"/>
+        </w:rPr>
+        <w:t xml:space="preserve"> (30)</w:t>
+      </w:r>
+      <w:r>
+        <w:rPr>
+          <w:rFonts w:ascii="Times New Roman" w:hAnsi="Times New Roman" w:cs="Times New Roman"/>
+        </w:rPr>
+        <w:tab/>
+        <w:t>Winner</w:t>
+      </w:r>
+    </w:p>
+    <w:p>
+      <w:pPr>
+        <w:rPr>
+          <w:rFonts w:ascii="Times New Roman" w:hAnsi="Times New Roman" w:cs="Times New Roman"/>
+        </w:rPr>
+      </w:pPr>
+      <w:r>
+        <w:rPr>
+          <w:rFonts w:ascii="Times New Roman" w:hAnsi="Times New Roman" w:cs="Times New Roman"/>
+        </w:rPr>
+        <w:t>1</w:t>
+      </w:r>
+      <w:r>
+        <w:rPr>
+          <w:rFonts w:ascii="Times New Roman" w:hAnsi="Times New Roman" w:cs="Times New Roman"/>
+        </w:rPr>
+        <w:tab/>
+        <w:t>28</w:t>
+      </w:r>
+      <w:r>
+        <w:rPr>
+          <w:rFonts w:ascii="Times New Roman" w:hAnsi="Times New Roman" w:cs="Times New Roman"/>
+        </w:rPr>
+        <w:tab/>
+        <w:t>30</w:t>
+      </w:r>
+      <w:r>
+        <w:rPr>
+          <w:rFonts w:ascii="Times New Roman" w:hAnsi="Times New Roman" w:cs="Times New Roman"/>
+        </w:rPr>
+        <w:tab/>
+        <w:t xml:space="preserve">repeated </w:t>
+      </w:r>
+      <w:proofErr w:type="gramStart"/>
+      <w:r>
+        <w:rPr>
+          <w:rFonts w:ascii="Times New Roman" w:hAnsi="Times New Roman" w:cs="Times New Roman"/>
+        </w:rPr>
+        <w:t>addition</w:t>
+      </w:r>
+      <w:proofErr w:type="gramEnd"/>
+    </w:p>
+    <w:p>
+      <w:pPr>
+        <w:rPr>
+          <w:rFonts w:ascii="Times New Roman" w:hAnsi="Times New Roman" w:cs="Times New Roman"/>
+        </w:rPr>
+      </w:pPr>
+      <w:r>
+        <w:rPr>
+          <w:rFonts w:ascii="Times New Roman" w:hAnsi="Times New Roman" w:cs="Times New Roman"/>
+        </w:rPr>
+        <w:t>2</w:t>
+      </w:r>
+      <w:r>
+        <w:rPr>
+          <w:rFonts w:ascii="Times New Roman" w:hAnsi="Times New Roman" w:cs="Times New Roman"/>
+        </w:rPr>
+        <w:tab/>
+        <w:t>42</w:t>
+      </w:r>
+      <w:r>
+        <w:rPr>
+          <w:rFonts w:ascii="Times New Roman" w:hAnsi="Times New Roman" w:cs="Times New Roman"/>
+        </w:rPr>
+        <w:tab/>
+        <w:t>30</w:t>
+      </w:r>
+      <w:r>
+        <w:rPr>
+          <w:rFonts w:ascii="Times New Roman" w:hAnsi="Times New Roman" w:cs="Times New Roman"/>
+        </w:rPr>
+        <w:tab/>
+      </w:r>
+      <w:proofErr w:type="spellStart"/>
+      <w:r>
+        <w:rPr>
+          <w:rFonts w:ascii="Times New Roman" w:hAnsi="Times New Roman" w:cs="Times New Roman"/>
+        </w:rPr>
+        <w:t>mul</w:t>
+      </w:r>
+      <w:proofErr w:type="spellEnd"/>
+    </w:p>
+    <w:p>
+      <w:pPr>
+        <w:rPr>
+          <w:rFonts w:ascii="Times New Roman" w:hAnsi="Times New Roman" w:cs="Times New Roman"/>
+        </w:rPr>
+      </w:pPr>
+      <w:r>
+        <w:rPr>
+          <w:rFonts w:ascii="Times New Roman" w:hAnsi="Times New Roman" w:cs="Times New Roman"/>
+        </w:rPr>
+        <w:t>10</w:t>
+      </w:r>
+      <w:r>
+        <w:rPr>
+          <w:rFonts w:ascii="Times New Roman" w:hAnsi="Times New Roman" w:cs="Times New Roman"/>
+        </w:rPr>
+        <w:tab/>
+        <w:t>154</w:t>
+      </w:r>
+      <w:r>
+        <w:rPr>
+          <w:rFonts w:ascii="Times New Roman" w:hAnsi="Times New Roman" w:cs="Times New Roman"/>
+        </w:rPr>
+        <w:tab/>
+        <w:t>30</w:t>
+      </w:r>
+      <w:r>
+        <w:rPr>
+          <w:rFonts w:ascii="Times New Roman" w:hAnsi="Times New Roman" w:cs="Times New Roman"/>
+        </w:rPr>
+        <w:tab/>
+      </w:r>
+      <w:proofErr w:type="spellStart"/>
+      <w:r>
+        <w:rPr>
+          <w:rFonts w:ascii="Times New Roman" w:hAnsi="Times New Roman" w:cs="Times New Roman"/>
+        </w:rPr>
+        <w:t>mul</w:t>
+      </w:r>
+      <w:proofErr w:type="spellEnd"/>
+      <w:r>
+        <w:rPr>
+          <w:rFonts w:ascii="Times New Roman" w:hAnsi="Times New Roman" w:cs="Times New Roman"/>
+        </w:rPr>
+        <w:t xml:space="preserve"> (5×)</w:t>
+      </w:r>
+    </w:p>
+    <w:p>
+      <w:pPr>
+        <w:rPr>
+          <w:rFonts w:ascii="Times New Roman" w:hAnsi="Times New Roman" w:cs="Times New Roman"/>
+        </w:rPr>
+      </w:pPr>
+      <w:r>
+        <w:rPr>
+          <w:rFonts w:ascii="Times New Roman" w:hAnsi="Times New Roman" w:cs="Times New Roman"/>
+        </w:rPr>
+        <w:t>100</w:t>
+      </w:r>
+      <w:r>
+        <w:rPr>
+          <w:rFonts w:ascii="Times New Roman" w:hAnsi="Times New Roman" w:cs="Times New Roman"/>
+        </w:rPr>
+        <w:tab/>
+        <w:t>1 414</w:t>
+      </w:r>
+      <w:r>
+        <w:rPr>
+          <w:rFonts w:ascii="Times New Roman" w:hAnsi="Times New Roman" w:cs="Times New Roman"/>
+        </w:rPr>
+        <w:tab/>
+        <w:t>30</w:t>
+      </w:r>
+      <w:r>
+        <w:rPr>
+          <w:rFonts w:ascii="Times New Roman" w:hAnsi="Times New Roman" w:cs="Times New Roman"/>
+        </w:rPr>
+        <w:tab/>
+      </w:r>
+      <w:proofErr w:type="spellStart"/>
+      <w:r>
+        <w:rPr>
+          <w:rFonts w:ascii="Times New Roman" w:hAnsi="Times New Roman" w:cs="Times New Roman"/>
+        </w:rPr>
+        <w:t>mul</w:t>
+      </w:r>
+      <w:proofErr w:type="spellEnd"/>
+      <w:r>
+        <w:rPr>
+          <w:rFonts w:ascii="Times New Roman" w:hAnsi="Times New Roman" w:cs="Times New Roman"/>
+        </w:rPr>
+        <w:t xml:space="preserve"> (47×)</w:t>
+      </w:r>
+    </w:p>
+    <w:p>
+      <w:pPr>
+        <w:rPr>
+          <w:rFonts w:ascii="Times New Roman" w:hAnsi="Times New Roman" w:cs="Times New Roman"/>
+        </w:rPr>
+      </w:pPr>
+    </w:p>
+    <w:p>
+      <w:pPr>
+        <w:rPr>
+          <w:rFonts w:ascii="Times New Roman" w:hAnsi="Times New Roman" w:cs="Times New Roman"/>
+        </w:rPr>
+      </w:pPr>
+      <w:r>
+        <w:rPr>
+          <w:rFonts w:ascii="Times New Roman" w:hAnsi="Times New Roman" w:cs="Times New Roman"/>
+        </w:rPr>
+        <w:t>Without RV32M, the best approach is an O(n) loop that builds each square from the previous one with no multiply:</w:t>
+      </w:r>
+    </w:p>
+    <w:p>
+      <w:pPr>
+        <w:rPr>
+          <w:rFonts w:ascii="Times New Roman" w:hAnsi="Times New Roman" w:cs="Times New Roman"/>
+        </w:rPr>
+      </w:pPr>
+      <w:r>
+        <w:rPr>
+          <w:rFonts w:ascii="Times New Roman" w:hAnsi="Times New Roman" w:cs="Times New Roman"/>
+        </w:rPr>
+        <w:t>(i+</w:t>
+      </w:r>
+      <w:proofErr w:type="gramStart"/>
+      <w:r>
+        <w:rPr>
+          <w:rFonts w:ascii="Times New Roman" w:hAnsi="Times New Roman" w:cs="Times New Roman"/>
+        </w:rPr>
+        <w:t>1)²</w:t>
+      </w:r>
+      <w:proofErr w:type="gramEnd"/>
+      <w:r>
+        <w:rPr>
+          <w:rFonts w:ascii="Times New Roman" w:hAnsi="Times New Roman" w:cs="Times New Roman"/>
+        </w:rPr>
+        <w:t xml:space="preserve"> = i² + (2i + 1)</w:t>
+      </w:r>
+    </w:p>
+    <w:p>
+      <w:pPr>
+        <w:rPr>
+          <w:rFonts w:ascii="Times New Roman" w:hAnsi="Times New Roman" w:cs="Times New Roman"/>
+        </w:rPr>
+      </w:pPr>
+      <w:r>
+        <w:rPr>
+          <w:rFonts w:ascii="Times New Roman" w:hAnsi="Times New Roman" w:cs="Times New Roman"/>
+        </w:rPr>
+        <w:lastRenderedPageBreak/>
+        <w:t>Total ≈ 85 + 19n cycles.</w:t>
+      </w:r>
+    </w:p>
+    <w:p>
+      <w:pPr>
+        <w:rPr>
+          <w:rFonts w:ascii="Times New Roman" w:hAnsi="Times New Roman" w:cs="Times New Roman"/>
+        </w:rPr>
+      </w:pPr>
+    </w:p>
+    <w:p>
+      <w:pPr>
+        <w:rPr>
+          <w:rFonts w:ascii="Times New Roman" w:hAnsi="Times New Roman" w:cs="Times New Roman"/>
+          <w:b/>
+          <w:bCs/>
+        </w:rPr>
+      </w:pPr>
+      <w:r>
+        <w:rPr>
+          <w:rFonts w:ascii="Times New Roman" w:hAnsi="Times New Roman" w:cs="Times New Roman"/>
+          <w:b/>
+          <w:bCs/>
+        </w:rPr>
+        <w:t>For which n is the optimized version not much faster?</w:t>
+      </w:r>
+    </w:p>
+    <w:tbl>
+      <w:tblPr>
+        <w:tblStyle w:val="TableGrid"/>
+        <w:tblW w:w="0" w:type="auto"/>
+        <w:tblLook w:val="04A0" w:firstRow="1" w:lastRow="0" w:firstColumn="1" w:lastColumn="0" w:noHBand="0" w:noVBand="1"/>
+      </w:tblPr>
+      <w:tblGrid>
+        <w:gridCol w:w="2337"/>
+        <w:gridCol w:w="2337"/>
+        <w:gridCol w:w="2338"/>
+        <w:gridCol w:w="2338"/>
+      </w:tblGrid>
+      <w:tr>
+        <w:tc>
+          <w:tcPr>
+            <w:tcW w:w="2337" w:type="dxa"/>
+            <w:vAlign w:val="center"/>
+          </w:tcPr>
+          <w:p>
+            <w:pPr>
+              <w:jc w:val="center"/>
+              <w:rPr>
+                <w:rFonts w:ascii="Times New Roman" w:hAnsi="Times New Roman" w:cs="Times New Roman"/>
+                <w:b/>
+                <w:bCs/>
+              </w:rPr>
+            </w:pPr>
+            <w:r>
+              <w:rPr>
+                <w:rFonts w:ascii="Times New Roman" w:hAnsi="Times New Roman" w:cs="Times New Roman"/>
+                <w:b/>
+                <w:bCs/>
+              </w:rPr>
+              <w:t>n</w:t>
+            </w:r>
+          </w:p>
+        </w:tc>
+        <w:tc>
+          <w:tcPr>
+            <w:tcW w:w="2337" w:type="dxa"/>
+            <w:vAlign w:val="center"/>
+          </w:tcPr>
+          <w:p>
+            <w:pPr>
+              <w:jc w:val="center"/>
+              <w:rPr>
+                <w:rFonts w:ascii="Times New Roman" w:hAnsi="Times New Roman" w:cs="Times New Roman"/>
+                <w:b/>
+                <w:bCs/>
+              </w:rPr>
+            </w:pPr>
+            <w:r>
+              <w:rPr>
+                <w:rFonts w:ascii="Times New Roman" w:hAnsi="Times New Roman" w:cs="Times New Roman"/>
+                <w:b/>
+                <w:bCs/>
+              </w:rPr>
+              <w:t>Original cycles (7n² + 81n + 106)</w:t>
+            </w:r>
+          </w:p>
+        </w:tc>
+        <w:tc>
+          <w:tcPr>
+            <w:tcW w:w="2338" w:type="dxa"/>
+            <w:vAlign w:val="center"/>
+          </w:tcPr>
+          <w:p>
+            <w:pPr>
+              <w:jc w:val="center"/>
+              <w:rPr>
+                <w:rFonts w:ascii="Times New Roman" w:hAnsi="Times New Roman" w:cs="Times New Roman"/>
+                <w:b/>
+                <w:bCs/>
+              </w:rPr>
+            </w:pPr>
+            <w:r>
+              <w:rPr>
+                <w:rFonts w:ascii="Times New Roman" w:hAnsi="Times New Roman" w:cs="Times New Roman"/>
+                <w:b/>
+                <w:bCs/>
+              </w:rPr>
+              <w:t>Optimized</w:t>
+            </w:r>
+          </w:p>
+        </w:tc>
+        <w:tc>
+          <w:tcPr>
+            <w:tcW w:w="2338" w:type="dxa"/>
+            <w:vAlign w:val="center"/>
+          </w:tcPr>
+          <w:p>
+            <w:pPr>
+              <w:jc w:val="center"/>
+              <w:rPr>
+                <w:rFonts w:ascii="Times New Roman" w:hAnsi="Times New Roman" w:cs="Times New Roman"/>
+                <w:b/>
+                <w:bCs/>
+              </w:rPr>
+            </w:pPr>
+            <w:r>
+              <w:rPr>
+                <w:rFonts w:ascii="Times New Roman" w:hAnsi="Times New Roman" w:cs="Times New Roman"/>
+                <w:b/>
+                <w:bCs/>
+              </w:rPr>
+              <w:t>Speedup</w:t>
+            </w:r>
+          </w:p>
+        </w:tc>
+      </w:tr>
+      <w:tr>
+        <w:tc>
+          <w:tcPr>
+            <w:tcW w:w="2337" w:type="dxa"/>
+            <w:vAlign w:val="center"/>
+          </w:tcPr>
+          <w:p>
+            <w:pPr>
+              <w:jc w:val="center"/>
+              <w:rPr>
+                <w:rFonts w:ascii="Times New Roman" w:hAnsi="Times New Roman" w:cs="Times New Roman"/>
+              </w:rPr>
+            </w:pPr>
+            <w:r>
+              <w:rPr>
+                <w:rFonts w:ascii="Times New Roman" w:hAnsi="Times New Roman" w:cs="Times New Roman"/>
+              </w:rPr>
+              <w:t>0</w:t>
+            </w:r>
+          </w:p>
+        </w:tc>
+        <w:tc>
+          <w:tcPr>
+            <w:tcW w:w="2337" w:type="dxa"/>
+            <w:vAlign w:val="center"/>
+          </w:tcPr>
+          <w:p>
+            <w:pPr>
+              <w:jc w:val="center"/>
+              <w:rPr>
+                <w:rFonts w:ascii="Times New Roman" w:hAnsi="Times New Roman" w:cs="Times New Roman"/>
+              </w:rPr>
+            </w:pPr>
+            <w:r>
+              <w:rPr>
+                <w:rFonts w:ascii="Times New Roman" w:hAnsi="Times New Roman" w:cs="Times New Roman"/>
+              </w:rPr>
+              <w:t>106</w:t>
+            </w:r>
+          </w:p>
+        </w:tc>
+        <w:tc>
+          <w:tcPr>
+            <w:tcW w:w="2338" w:type="dxa"/>
+            <w:vAlign w:val="center"/>
+          </w:tcPr>
+          <w:p>
+            <w:pPr>
+              <w:jc w:val="center"/>
+              <w:rPr>
+                <w:rFonts w:ascii="Times New Roman" w:hAnsi="Times New Roman" w:cs="Times New Roman"/>
+              </w:rPr>
+            </w:pPr>
+            <w:r>
+              <w:rPr>
+                <w:rFonts w:ascii="Times New Roman" w:hAnsi="Times New Roman" w:cs="Times New Roman"/>
+              </w:rPr>
+              <w:t>177</w:t>
+            </w:r>
+          </w:p>
+        </w:tc>
+        <w:tc>
+          <w:tcPr>
+            <w:tcW w:w="2338" w:type="dxa"/>
+            <w:vAlign w:val="center"/>
+          </w:tcPr>
+          <w:p>
+            <w:pPr>
+              <w:jc w:val="center"/>
+              <w:rPr>
+                <w:rFonts w:ascii="Times New Roman" w:hAnsi="Times New Roman" w:cs="Times New Roman"/>
+              </w:rPr>
+            </w:pPr>
+            <w:r>
+              <w:rPr>
+                <w:rStyle w:val="Strong"/>
+                <w:rFonts w:ascii="Times New Roman" w:hAnsi="Times New Roman" w:cs="Times New Roman"/>
+                <w:b w:val="0"/>
+                <w:bCs w:val="0"/>
+              </w:rPr>
+              <w:t>0.60×</w:t>
+            </w:r>
+            <w:r>
+              <w:rPr>
+                <w:rFonts w:ascii="Times New Roman" w:hAnsi="Times New Roman" w:cs="Times New Roman"/>
+              </w:rPr>
+              <w:t xml:space="preserve"> (slower)</w:t>
+            </w:r>
+          </w:p>
+        </w:tc>
+      </w:tr>
+      <w:tr>
+        <w:tc>
+          <w:tcPr>
+            <w:tcW w:w="2337" w:type="dxa"/>
+            <w:vAlign w:val="center"/>
+          </w:tcPr>
+          <w:p>
+            <w:pPr>
+              <w:jc w:val="center"/>
+              <w:rPr>
+                <w:rFonts w:ascii="Times New Roman" w:hAnsi="Times New Roman" w:cs="Times New Roman"/>
+              </w:rPr>
+            </w:pPr>
+            <w:r>
+              <w:rPr>
+                <w:rFonts w:ascii="Times New Roman" w:hAnsi="Times New Roman" w:cs="Times New Roman"/>
+              </w:rPr>
+              <w:t>1</w:t>
+            </w:r>
+          </w:p>
+        </w:tc>
+        <w:tc>
+          <w:tcPr>
+            <w:tcW w:w="2337" w:type="dxa"/>
+            <w:vAlign w:val="center"/>
+          </w:tcPr>
+          <w:p>
+            <w:pPr>
+              <w:jc w:val="center"/>
+              <w:rPr>
+                <w:rFonts w:ascii="Times New Roman" w:hAnsi="Times New Roman" w:cs="Times New Roman"/>
+              </w:rPr>
+            </w:pPr>
+            <w:r>
+              <w:rPr>
+                <w:rFonts w:ascii="Times New Roman" w:hAnsi="Times New Roman" w:cs="Times New Roman"/>
+              </w:rPr>
+              <w:t>194</w:t>
+            </w:r>
+          </w:p>
+        </w:tc>
+        <w:tc>
+          <w:tcPr>
+            <w:tcW w:w="2338" w:type="dxa"/>
+            <w:vAlign w:val="center"/>
+          </w:tcPr>
+          <w:p>
+            <w:pPr>
+              <w:jc w:val="center"/>
+              <w:rPr>
+                <w:rFonts w:ascii="Times New Roman" w:hAnsi="Times New Roman" w:cs="Times New Roman"/>
+              </w:rPr>
+            </w:pPr>
+            <w:r>
+              <w:rPr>
+                <w:rFonts w:ascii="Times New Roman" w:hAnsi="Times New Roman" w:cs="Times New Roman"/>
+              </w:rPr>
+              <w:t>177</w:t>
+            </w:r>
+          </w:p>
+        </w:tc>
+        <w:tc>
+          <w:tcPr>
+            <w:tcW w:w="2338" w:type="dxa"/>
+            <w:vAlign w:val="center"/>
+          </w:tcPr>
+          <w:p>
+            <w:pPr>
+              <w:jc w:val="center"/>
+              <w:rPr>
+                <w:rFonts w:ascii="Times New Roman" w:hAnsi="Times New Roman" w:cs="Times New Roman"/>
+              </w:rPr>
+            </w:pPr>
+            <w:r>
+              <w:rPr>
+                <w:rStyle w:val="Strong"/>
+                <w:rFonts w:ascii="Times New Roman" w:hAnsi="Times New Roman" w:cs="Times New Roman"/>
+                <w:b w:val="0"/>
+                <w:bCs w:val="0"/>
+              </w:rPr>
+              <w:t>1.10×</w:t>
+            </w:r>
+          </w:p>
+        </w:tc>
+      </w:tr>
+      <w:tr>
+        <w:tc>
+          <w:tcPr>
+            <w:tcW w:w="2337" w:type="dxa"/>
+            <w:vAlign w:val="center"/>
+          </w:tcPr>
+          <w:p>
+            <w:pPr>
+              <w:jc w:val="center"/>
+              <w:rPr>
+                <w:rFonts w:ascii="Times New Roman" w:hAnsi="Times New Roman" w:cs="Times New Roman"/>
+              </w:rPr>
+            </w:pPr>
+            <w:r>
+              <w:rPr>
+                <w:rFonts w:ascii="Times New Roman" w:hAnsi="Times New Roman" w:cs="Times New Roman"/>
+              </w:rPr>
+              <w:t>2</w:t>
+            </w:r>
+          </w:p>
+        </w:tc>
+        <w:tc>
+          <w:tcPr>
+            <w:tcW w:w="2337" w:type="dxa"/>
+            <w:vAlign w:val="center"/>
+          </w:tcPr>
+          <w:p>
+            <w:pPr>
+              <w:jc w:val="center"/>
+              <w:rPr>
+                <w:rFonts w:ascii="Times New Roman" w:hAnsi="Times New Roman" w:cs="Times New Roman"/>
+              </w:rPr>
+            </w:pPr>
+            <w:r>
+              <w:rPr>
+                <w:rFonts w:ascii="Times New Roman" w:hAnsi="Times New Roman" w:cs="Times New Roman"/>
+              </w:rPr>
+              <w:t>296</w:t>
+            </w:r>
+          </w:p>
+        </w:tc>
+        <w:tc>
+          <w:tcPr>
+            <w:tcW w:w="2338" w:type="dxa"/>
+            <w:vAlign w:val="center"/>
+          </w:tcPr>
+          <w:p>
+            <w:pPr>
+              <w:jc w:val="center"/>
+              <w:rPr>
+                <w:rFonts w:ascii="Times New Roman" w:hAnsi="Times New Roman" w:cs="Times New Roman"/>
+              </w:rPr>
+            </w:pPr>
+            <w:r>
+              <w:rPr>
+                <w:rFonts w:ascii="Times New Roman" w:hAnsi="Times New Roman" w:cs="Times New Roman"/>
+              </w:rPr>
+              <w:t>177</w:t>
+            </w:r>
+          </w:p>
+        </w:tc>
+        <w:tc>
+          <w:tcPr>
+            <w:tcW w:w="2338" w:type="dxa"/>
+            <w:vAlign w:val="center"/>
+          </w:tcPr>
+          <w:p>
+            <w:pPr>
+              <w:jc w:val="center"/>
+              <w:rPr>
+                <w:rFonts w:ascii="Times New Roman" w:hAnsi="Times New Roman" w:cs="Times New Roman"/>
+              </w:rPr>
+            </w:pPr>
+            <w:r>
+              <w:rPr>
+                <w:rStyle w:val="Strong"/>
+                <w:rFonts w:ascii="Times New Roman" w:hAnsi="Times New Roman" w:cs="Times New Roman"/>
+                <w:b w:val="0"/>
+                <w:bCs w:val="0"/>
+              </w:rPr>
+              <w:t>1.67×</w:t>
+            </w:r>
+          </w:p>
+        </w:tc>
+      </w:tr>
+      <w:tr>
+        <w:tc>
+          <w:tcPr>
+            <w:tcW w:w="2337" w:type="dxa"/>
+            <w:vAlign w:val="center"/>
+          </w:tcPr>
+          <w:p>
+            <w:pPr>
+              <w:jc w:val="center"/>
+              <w:rPr>
+                <w:rFonts w:ascii="Times New Roman" w:hAnsi="Times New Roman" w:cs="Times New Roman"/>
+              </w:rPr>
+            </w:pPr>
+            <w:r>
+              <w:rPr>
+                <w:rFonts w:ascii="Times New Roman" w:hAnsi="Times New Roman" w:cs="Times New Roman"/>
+              </w:rPr>
+              <w:t>5</w:t>
+            </w:r>
+          </w:p>
+        </w:tc>
+        <w:tc>
+          <w:tcPr>
+            <w:tcW w:w="2337" w:type="dxa"/>
+            <w:vAlign w:val="center"/>
+          </w:tcPr>
+          <w:p>
+            <w:pPr>
+              <w:jc w:val="center"/>
+              <w:rPr>
+                <w:rFonts w:ascii="Times New Roman" w:hAnsi="Times New Roman" w:cs="Times New Roman"/>
+              </w:rPr>
+            </w:pPr>
+            <w:r>
+              <w:rPr>
+                <w:rFonts w:ascii="Times New Roman" w:hAnsi="Times New Roman" w:cs="Times New Roman"/>
+              </w:rPr>
+              <w:t>686</w:t>
+            </w:r>
+          </w:p>
+        </w:tc>
+        <w:tc>
+          <w:tcPr>
+            <w:tcW w:w="2338" w:type="dxa"/>
+            <w:vAlign w:val="center"/>
+          </w:tcPr>
+          <w:p>
+            <w:pPr>
+              <w:jc w:val="center"/>
+              <w:rPr>
+                <w:rFonts w:ascii="Times New Roman" w:hAnsi="Times New Roman" w:cs="Times New Roman"/>
+              </w:rPr>
+            </w:pPr>
+            <w:r>
+              <w:rPr>
+                <w:rFonts w:ascii="Times New Roman" w:hAnsi="Times New Roman" w:cs="Times New Roman"/>
+              </w:rPr>
+              <w:t>177</w:t>
+            </w:r>
+          </w:p>
+        </w:tc>
+        <w:tc>
+          <w:tcPr>
+            <w:tcW w:w="2338" w:type="dxa"/>
+            <w:vAlign w:val="center"/>
+          </w:tcPr>
+          <w:p>
+            <w:pPr>
+              <w:jc w:val="center"/>
+              <w:rPr>
+                <w:rFonts w:ascii="Times New Roman" w:hAnsi="Times New Roman" w:cs="Times New Roman"/>
+              </w:rPr>
+            </w:pPr>
+            <w:r>
+              <w:rPr>
+                <w:rFonts w:ascii="Times New Roman" w:hAnsi="Times New Roman" w:cs="Times New Roman"/>
+              </w:rPr>
+              <w:t>3.88×</w:t>
+            </w:r>
+          </w:p>
+        </w:tc>
+      </w:tr>
+      <w:tr>
+        <w:tc>
+          <w:tcPr>
+            <w:tcW w:w="2337" w:type="dxa"/>
+            <w:vAlign w:val="center"/>
+          </w:tcPr>
+          <w:p>
+            <w:pPr>
+              <w:jc w:val="center"/>
+              <w:rPr>
+                <w:rFonts w:ascii="Times New Roman" w:hAnsi="Times New Roman" w:cs="Times New Roman"/>
+              </w:rPr>
+            </w:pPr>
+            <w:r>
+              <w:rPr>
+                <w:rFonts w:ascii="Times New Roman" w:hAnsi="Times New Roman" w:cs="Times New Roman"/>
+              </w:rPr>
+              <w:t>10</w:t>
+            </w:r>
+          </w:p>
+        </w:tc>
+        <w:tc>
+          <w:tcPr>
+            <w:tcW w:w="2337" w:type="dxa"/>
+            <w:vAlign w:val="center"/>
+          </w:tcPr>
+          <w:p>
+            <w:pPr>
+              <w:jc w:val="center"/>
+              <w:rPr>
+                <w:rFonts w:ascii="Times New Roman" w:hAnsi="Times New Roman" w:cs="Times New Roman"/>
+              </w:rPr>
+            </w:pPr>
+            <w:r>
+              <w:rPr>
+                <w:rFonts w:ascii="Times New Roman" w:hAnsi="Times New Roman" w:cs="Times New Roman"/>
+              </w:rPr>
+              <w:t>1 616</w:t>
+            </w:r>
+          </w:p>
+        </w:tc>
+        <w:tc>
+          <w:tcPr>
+            <w:tcW w:w="2338" w:type="dxa"/>
+            <w:vAlign w:val="center"/>
+          </w:tcPr>
+          <w:p>
+            <w:pPr>
+              <w:jc w:val="center"/>
+              <w:rPr>
+                <w:rFonts w:ascii="Times New Roman" w:hAnsi="Times New Roman" w:cs="Times New Roman"/>
+              </w:rPr>
+            </w:pPr>
+            <w:r>
+              <w:rPr>
+                <w:rFonts w:ascii="Times New Roman" w:hAnsi="Times New Roman" w:cs="Times New Roman"/>
+              </w:rPr>
+              <w:t>177</w:t>
+            </w:r>
+          </w:p>
+        </w:tc>
+        <w:tc>
+          <w:tcPr>
+            <w:tcW w:w="2338" w:type="dxa"/>
+            <w:vAlign w:val="center"/>
+          </w:tcPr>
+          <w:p>
+            <w:pPr>
+              <w:jc w:val="center"/>
+              <w:rPr>
+                <w:rFonts w:ascii="Times New Roman" w:hAnsi="Times New Roman" w:cs="Times New Roman"/>
+              </w:rPr>
+            </w:pPr>
+            <w:r>
+              <w:rPr>
+                <w:rFonts w:ascii="Times New Roman" w:hAnsi="Times New Roman" w:cs="Times New Roman"/>
+              </w:rPr>
+              <w:t>9.13×</w:t>
+            </w:r>
+          </w:p>
+        </w:tc>
+      </w:tr>
+      <w:tr>
+        <w:tc>
+          <w:tcPr>
+            <w:tcW w:w="2337" w:type="dxa"/>
+            <w:vAlign w:val="center"/>
+          </w:tcPr>
+          <w:p>
+            <w:pPr>
+              <w:jc w:val="center"/>
+              <w:rPr>
+                <w:rFonts w:ascii="Times New Roman" w:hAnsi="Times New Roman" w:cs="Times New Roman"/>
+              </w:rPr>
+            </w:pPr>
+            <w:r>
+              <w:rPr>
+                <w:rFonts w:ascii="Times New Roman" w:hAnsi="Times New Roman" w:cs="Times New Roman"/>
+              </w:rPr>
+              <w:t>20</w:t>
+            </w:r>
+          </w:p>
+        </w:tc>
+        <w:tc>
+          <w:tcPr>
+            <w:tcW w:w="2337" w:type="dxa"/>
+            <w:vAlign w:val="center"/>
+          </w:tcPr>
+          <w:p>
+            <w:pPr>
+              <w:jc w:val="center"/>
+              <w:rPr>
+                <w:rFonts w:ascii="Times New Roman" w:hAnsi="Times New Roman" w:cs="Times New Roman"/>
+              </w:rPr>
+            </w:pPr>
+            <w:r>
+              <w:rPr>
+                <w:rFonts w:ascii="Times New Roman" w:hAnsi="Times New Roman" w:cs="Times New Roman"/>
+              </w:rPr>
+              <w:t>4 526</w:t>
+            </w:r>
+          </w:p>
+        </w:tc>
+        <w:tc>
+          <w:tcPr>
+            <w:tcW w:w="2338" w:type="dxa"/>
+            <w:vAlign w:val="center"/>
+          </w:tcPr>
+          <w:p>
+            <w:pPr>
+              <w:jc w:val="center"/>
+              <w:rPr>
+                <w:rFonts w:ascii="Times New Roman" w:hAnsi="Times New Roman" w:cs="Times New Roman"/>
+              </w:rPr>
+            </w:pPr>
+            <w:r>
+              <w:rPr>
+                <w:rFonts w:ascii="Times New Roman" w:hAnsi="Times New Roman" w:cs="Times New Roman"/>
+              </w:rPr>
+              <w:t>177</w:t>
+            </w:r>
+          </w:p>
+        </w:tc>
+        <w:tc>
+          <w:tcPr>
+            <w:tcW w:w="2338" w:type="dxa"/>
+            <w:vAlign w:val="center"/>
+          </w:tcPr>
+          <w:p>
+            <w:pPr>
+              <w:jc w:val="center"/>
+              <w:rPr>
+                <w:rFonts w:ascii="Times New Roman" w:hAnsi="Times New Roman" w:cs="Times New Roman"/>
+              </w:rPr>
+            </w:pPr>
+            <w:r>
+              <w:rPr>
+                <w:rFonts w:ascii="Times New Roman" w:hAnsi="Times New Roman" w:cs="Times New Roman"/>
+              </w:rPr>
+              <w:t>25.6×</w:t>
+            </w:r>
+          </w:p>
+        </w:tc>
+      </w:tr>
+      <w:tr>
+        <w:tc>
+          <w:tcPr>
+            <w:tcW w:w="2337" w:type="dxa"/>
+            <w:vAlign w:val="center"/>
+          </w:tcPr>
+          <w:p>
+            <w:pPr>
+              <w:jc w:val="center"/>
+              <w:rPr>
+                <w:rFonts w:ascii="Times New Roman" w:hAnsi="Times New Roman" w:cs="Times New Roman"/>
+              </w:rPr>
+            </w:pPr>
+            <w:r>
+              <w:rPr>
+                <w:rFonts w:ascii="Times New Roman" w:hAnsi="Times New Roman" w:cs="Times New Roman"/>
+              </w:rPr>
+              <w:t>100</w:t>
+            </w:r>
+          </w:p>
+        </w:tc>
+        <w:tc>
+          <w:tcPr>
+            <w:tcW w:w="2337" w:type="dxa"/>
+            <w:vAlign w:val="center"/>
+          </w:tcPr>
+          <w:p>
+            <w:pPr>
+              <w:jc w:val="center"/>
+              <w:rPr>
+                <w:rFonts w:ascii="Times New Roman" w:hAnsi="Times New Roman" w:cs="Times New Roman"/>
+              </w:rPr>
+            </w:pPr>
+            <w:r>
+              <w:rPr>
+                <w:rFonts w:ascii="Times New Roman" w:hAnsi="Times New Roman" w:cs="Times New Roman"/>
+              </w:rPr>
+              <w:t>78 206</w:t>
+            </w:r>
+          </w:p>
+        </w:tc>
+        <w:tc>
+          <w:tcPr>
+            <w:tcW w:w="2338" w:type="dxa"/>
+            <w:vAlign w:val="center"/>
+          </w:tcPr>
+          <w:p>
+            <w:pPr>
+              <w:jc w:val="center"/>
+              <w:rPr>
+                <w:rFonts w:ascii="Times New Roman" w:hAnsi="Times New Roman" w:cs="Times New Roman"/>
+              </w:rPr>
+            </w:pPr>
+            <w:r>
+              <w:rPr>
+                <w:rFonts w:ascii="Times New Roman" w:hAnsi="Times New Roman" w:cs="Times New Roman"/>
+              </w:rPr>
+              <w:t>177</w:t>
+            </w:r>
+          </w:p>
+        </w:tc>
+        <w:tc>
+          <w:tcPr>
+            <w:tcW w:w="2338" w:type="dxa"/>
+            <w:vAlign w:val="center"/>
+          </w:tcPr>
+          <w:p>
+            <w:pPr>
+              <w:jc w:val="center"/>
+              <w:rPr>
+                <w:rFonts w:ascii="Times New Roman" w:hAnsi="Times New Roman" w:cs="Times New Roman"/>
+              </w:rPr>
+            </w:pPr>
+            <w:r>
+              <w:rPr>
+                <w:rFonts w:ascii="Times New Roman" w:hAnsi="Times New Roman" w:cs="Times New Roman"/>
+              </w:rPr>
+              <w:t>441.8×</w:t>
+            </w:r>
+          </w:p>
+        </w:tc>
+      </w:tr>
+    </w:tbl>
+    <w:p>
+      <w:pPr>
+        <w:rPr>
+          <w:rFonts w:ascii="Times New Roman" w:hAnsi="Times New Roman" w:cs="Times New Roman"/>
+        </w:rPr>
+      </w:pPr>
+    </w:p>
+    <w:p>
+      <w:pPr>
+        <w:rPr>
+          <w:rFonts w:ascii="Times New Roman" w:hAnsi="Times New Roman" w:cs="Times New Roman"/>
+        </w:rPr>
+      </w:pPr>
+      <w:r>
+        <w:rPr>
+          <w:rFonts w:ascii="Times New Roman" w:hAnsi="Times New Roman" w:cs="Times New Roman"/>
+        </w:rPr>
+        <w:t xml:space="preserve">At n &lt;= 2, optimized version is faster. At n = 0, the version is slower. </w:t>
+      </w:r>
+      <w:r>
+        <w:rPr>
+          <w:rFonts w:ascii="Times New Roman" w:hAnsi="Times New Roman" w:cs="Times New Roman"/>
+        </w:rPr>
+        <w:t>Th</w:t>
+      </w:r>
+      <w:r>
+        <w:rPr>
+          <w:rFonts w:ascii="Times New Roman" w:hAnsi="Times New Roman" w:cs="Times New Roman"/>
+        </w:rPr>
+        <w:t xml:space="preserve">is is because the original </w:t>
+      </w:r>
+      <w:proofErr w:type="gramStart"/>
+      <w:r>
+        <w:rPr>
+          <w:rFonts w:ascii="Times New Roman" w:hAnsi="Times New Roman" w:cs="Times New Roman"/>
+        </w:rPr>
+        <w:t>version</w:t>
+      </w:r>
+      <w:proofErr w:type="gramEnd"/>
+      <w:r>
+        <w:rPr>
+          <w:rFonts w:ascii="Times New Roman" w:hAnsi="Times New Roman" w:cs="Times New Roman"/>
+        </w:rPr>
+        <w:t xml:space="preserve"> cost grows with n, but the optimized cost is fixed</w:t>
+      </w:r>
+      <w:r>
+        <w:rPr>
+          <w:rFonts w:ascii="Times New Roman" w:hAnsi="Times New Roman" w:cs="Times New Roman"/>
+        </w:rPr>
+        <w:t>. At smaller values for n, the original n</w:t>
+      </w:r>
+      <w:r>
+        <w:rPr>
+          <w:rFonts w:ascii="Times New Roman" w:hAnsi="Times New Roman" w:cs="Times New Roman"/>
+          <w:vertAlign w:val="superscript"/>
+        </w:rPr>
+        <w:t>2</w:t>
+      </w:r>
+      <w:r>
+        <w:rPr>
+          <w:rFonts w:ascii="Times New Roman" w:hAnsi="Times New Roman" w:cs="Times New Roman"/>
+          <w:vertAlign w:val="subscript"/>
+        </w:rPr>
+        <w:t xml:space="preserve"> </w:t>
+      </w:r>
+      <w:r>
+        <w:rPr>
+          <w:rFonts w:ascii="Times New Roman" w:hAnsi="Times New Roman" w:cs="Times New Roman"/>
+        </w:rPr>
+        <w:t>is ~0</w:t>
+      </w:r>
+      <w:r>
+        <w:rPr>
+          <w:rFonts w:ascii="Times New Roman" w:hAnsi="Times New Roman" w:cs="Times New Roman"/>
+        </w:rPr>
+        <w:t>, meaning it costs a little more than setup and printing instructions.</w:t>
+      </w:r>
+    </w:p>
+    <w:p>
+      <w:pPr>
+        <w:rPr>
+          <w:rFonts w:ascii="Times New Roman" w:hAnsi="Times New Roman" w:cs="Times New Roman"/>
+        </w:rPr>
+      </w:pPr>
+    </w:p>
+    <w:p>
+      <w:pPr>
+        <w:rPr>
+          <w:rFonts w:ascii="Times New Roman" w:hAnsi="Times New Roman" w:cs="Times New Roman"/>
+          <w:b/>
+          <w:bCs/>
+        </w:rPr>
+      </w:pPr>
+      <w:r>
+        <w:rPr>
+          <w:rFonts w:ascii="Times New Roman" w:hAnsi="Times New Roman" w:cs="Times New Roman"/>
+          <w:b/>
+          <w:bCs/>
+        </w:rPr>
+        <w:t>Graduate component</w:t>
+      </w:r>
+    </w:p>
+    <w:p>
+      <w:pPr>
+        <w:rPr>
+          <w:rFonts w:ascii="Times New Roman" w:hAnsi="Times New Roman" w:cs="Times New Roman"/>
+          <w:b/>
+          <w:bCs/>
+        </w:rPr>
+      </w:pPr>
+      <w:r>
+        <w:rPr>
+          <w:rFonts w:ascii="Times New Roman" w:hAnsi="Times New Roman" w:cs="Times New Roman"/>
+          <w:b/>
+          <w:bCs/>
+        </w:rPr>
+        <w:t>G1.</w:t>
+      </w:r>
     </w:p>
     <w:p>
       <w:pPr>
@@ -1810,6 +4537,25 @@
       <w:bCs/>
     </w:rPr>
   </w:style>
+  <w:style w:type="table" w:styleId="TableGrid">
+    <w:name w:val="Table Grid"/>
+    <w:basedOn w:val="TableNormal"/>
+    <w:uiPriority w:val="39"/>
+    <w:rsid w:val="00D93CB4"/>
+    <w:pPr>
+      <w:spacing w:after="0" w:line="240" w:lineRule="auto"/>
+    </w:pPr>
+    <w:tblPr>
+      <w:tblBorders>
+        <w:top w:val="single" w:sz="4" w:space="0" w:color="auto"/>
+        <w:left w:val="single" w:sz="4" w:space="0" w:color="auto"/>
+        <w:bottom w:val="single" w:sz="4" w:space="0" w:color="auto"/>
+        <w:right w:val="single" w:sz="4" w:space="0" w:color="auto"/>
+        <w:insideH w:val="single" w:sz="4" w:space="0" w:color="auto"/>
+        <w:insideV w:val="single" w:sz="4" w:space="0" w:color="auto"/>
+      </w:tblBorders>
+    </w:tblPr>
+  </w:style>
 </w:styles>
 </file>
 

</xml_diff>